<commit_message>
Switch LLM from Gemini 3.1 Flash Lite to Gemma 3 4B (local)
- paper.md: Updated all references from Gemini to Gemma 3 4B
- Added 'Local Inference Design Rationale' section with specs table
- Added Gemma 3 references (model card, tech report, VRAM guide)
- New abstract emphasizing fully local, zero cloud dependency
- Updated tech stack: Gemma 3 4B via Ollama/llama.cpp
- Added paper-gemini.md/docx/pdf as archived Gemini version
- Regenerated paper.pdf (196KB) and paper.docx (136KB)
</commit_message>
<xml_diff>
--- a/paper.docx
+++ b/paper.docx
@@ -269,7 +269,13 @@
         <w:t xml:space="preserve"> </w:t>
       </w:r>
       <w:r>
-        <w:t xml:space="preserve">local-first</w:t>
+        <w:t xml:space="preserve">fully</w:t>
+      </w:r>
+      <w:r>
+        <w:t xml:space="preserve"> </w:t>
+      </w:r>
+      <w:r>
+        <w:t xml:space="preserve">local</w:t>
       </w:r>
       <w:r>
         <w:t xml:space="preserve"> </w:t>
@@ -467,7 +473,49 @@
         <w:t xml:space="preserve"> </w:t>
       </w:r>
       <w:r>
-        <w:t xml:space="preserve">hardware,</w:t>
+        <w:t xml:space="preserve">hardware</w:t>
+      </w:r>
+      <w:r>
+        <w:t xml:space="preserve"> </w:t>
+      </w:r>
+      <w:r>
+        <w:t xml:space="preserve">using</w:t>
+      </w:r>
+      <w:r>
+        <w:t xml:space="preserve"> </w:t>
+      </w:r>
+      <w:r>
+        <w:t xml:space="preserve">the</w:t>
+      </w:r>
+      <w:r>
+        <w:t xml:space="preserve"> </w:t>
+      </w:r>
+      <w:r>
+        <w:t xml:space="preserve">open-weight</w:t>
+      </w:r>
+      <w:r>
+        <w:t xml:space="preserve"> </w:t>
+      </w:r>
+      <w:r>
+        <w:t xml:space="preserve">Gemma</w:t>
+      </w:r>
+      <w:r>
+        <w:t xml:space="preserve"> </w:t>
+      </w:r>
+      <w:r>
+        <w:t xml:space="preserve">3</w:t>
+      </w:r>
+      <w:r>
+        <w:t xml:space="preserve"> </w:t>
+      </w:r>
+      <w:r>
+        <w:t xml:space="preserve">4B</w:t>
+      </w:r>
+      <w:r>
+        <w:t xml:space="preserve"> </w:t>
+      </w:r>
+      <w:r>
+        <w:t xml:space="preserve">model,</w:t>
       </w:r>
       <w:r>
         <w:t xml:space="preserve"> </w:t>
@@ -743,25 +791,19 @@
         <w:t xml:space="preserve"> </w:t>
       </w:r>
       <w:r>
-        <w:t xml:space="preserve">Gemini</w:t>
-      </w:r>
-      <w:r>
-        <w:t xml:space="preserve"> </w:t>
-      </w:r>
-      <w:r>
-        <w:t xml:space="preserve">3.1</w:t>
-      </w:r>
-      <w:r>
-        <w:t xml:space="preserve"> </w:t>
-      </w:r>
-      <w:r>
-        <w:t xml:space="preserve">Flash</w:t>
-      </w:r>
-      <w:r>
-        <w:t xml:space="preserve"> </w:t>
-      </w:r>
-      <w:r>
-        <w:t xml:space="preserve">Lite</w:t>
+        <w:t xml:space="preserve">Gemma</w:t>
+      </w:r>
+      <w:r>
+        <w:t xml:space="preserve"> </w:t>
+      </w:r>
+      <w:r>
+        <w:t xml:space="preserve">3</w:t>
+      </w:r>
+      <w:r>
+        <w:t xml:space="preserve"> </w:t>
+      </w:r>
+      <w:r>
+        <w:t xml:space="preserve">4B</w:t>
       </w:r>
       <w:r>
         <w:t xml:space="preserve"> </w:t>
@@ -774,6 +816,12 @@
       </w:r>
       <w:r>
         <w:t xml:space="preserve">the</w:t>
+      </w:r>
+      <w:r>
+        <w:t xml:space="preserve"> </w:t>
+      </w:r>
+      <w:r>
+        <w:t xml:space="preserve">local</w:t>
       </w:r>
       <w:r>
         <w:t xml:space="preserve"> </w:t>
@@ -1020,7 +1068,7 @@
         <w:t xml:space="preserve"> </w:t>
       </w:r>
       <w:r>
-        <w:t xml:space="preserve">[15]</w:t>
+        <w:t xml:space="preserve">[16]</w:t>
       </w:r>
       <w:r>
         <w:t xml:space="preserve"> </w:t>
@@ -1032,7 +1080,7 @@
         <w:t xml:space="preserve"> </w:t>
       </w:r>
       <w:r>
-        <w:t xml:space="preserve">[1, 12]</w:t>
+        <w:t xml:space="preserve">[1, 13]</w:t>
       </w:r>
       <w:r>
         <w:t xml:space="preserve">. Yet the dominant paradigm remains cloud-centric: user data flows to remote servers, personalities are stateless between sessions, and the user has little control over the behavioural parameters of their digital companion.</w:t>
@@ -1053,7 +1101,7 @@
           <w:i/>
           <w:iCs/>
         </w:rPr>
-        <w:t xml:space="preserve">local-first</w:t>
+        <w:t xml:space="preserve">fully local</w:t>
       </w:r>
       <w:r>
         <w:t xml:space="preserve"> </w:t>
@@ -1175,7 +1223,7 @@
         </w:numPr>
       </w:pPr>
       <w:r>
-        <w:t xml:space="preserve">A comprehensive architectural blueprint for local-first AI companion systems</w:t>
+        <w:t xml:space="preserve">A comprehensive architectural blueprint for fully local AI companion systems</w:t>
       </w:r>
     </w:p>
     <w:p>
@@ -1211,11 +1259,23 @@
         </w:numPr>
       </w:pPr>
       <w:r>
+        <w:t xml:space="preserve">A design rationale for selecting Gemma 3 4B as a local-first reasoning backbone</w:t>
+      </w:r>
+    </w:p>
+    <w:p>
+      <w:pPr>
+        <w:pStyle w:val="Compact"/>
+        <w:numPr>
+          <w:ilvl w:val="0"/>
+          <w:numId w:val="1002"/>
+        </w:numPr>
+      </w:pPr>
+      <w:r>
         <w:t xml:space="preserve">A discussion of the ethical and behavioural implications of personality-rich AI companions</w:t>
       </w:r>
     </w:p>
     <w:bookmarkEnd w:id="20"/>
-    <w:bookmarkStart w:id="25" w:name="related-work"/>
+    <w:bookmarkStart w:id="26" w:name="related-work"/>
     <w:p>
       <w:pPr>
         <w:pStyle w:val="Heading1"/>
@@ -1244,22 +1304,60 @@
         <w:t xml:space="preserve"> </w:t>
       </w:r>
       <w:r>
+        <w:t xml:space="preserve">[15]</w:t>
+      </w:r>
+      <w:r>
+        <w:t xml:space="preserve">. Chen et al.</w:t>
+      </w:r>
+      <w:r>
+        <w:t xml:space="preserve"> </w:t>
+      </w:r>
+      <w:r>
+        <w:t xml:space="preserve">[1]</w:t>
+      </w:r>
+      <w:r>
+        <w:t xml:space="preserve"> </w:t>
+      </w:r>
+      <w:r>
+        <w:t xml:space="preserve">provide a comprehensive taxonomy of persona in role-playing language agents (RPLAs), categorizing personas into three types: demographic personas (statistical stereotypes), character personas (established figures), and individualized personas (customized through ongoing user interactions). Our work primarily operates in the third category, where the companion’s personality is continuously shaped by user interaction.</w:t>
+      </w:r>
+    </w:p>
+    <w:p>
+      <w:pPr>
+        <w:pStyle w:val="BodyText"/>
+      </w:pPr>
+      <w:r>
+        <w:t xml:space="preserve">Tseng et al.</w:t>
+      </w:r>
+      <w:r>
+        <w:t xml:space="preserve"> </w:t>
+      </w:r>
+      <w:r>
         <w:t xml:space="preserve">[14]</w:t>
       </w:r>
       <w:r>
-        <w:t xml:space="preserve">. Chen et al.</w:t>
-      </w:r>
-      <w:r>
-        <w:t xml:space="preserve"> </w:t>
-      </w:r>
-      <w:r>
-        <w:t xml:space="preserve">[1]</w:t>
-      </w:r>
-      <w:r>
-        <w:t xml:space="preserve"> </w:t>
-      </w:r>
-      <w:r>
-        <w:t xml:space="preserve">provide a comprehensive taxonomy of persona in role-playing language agents (RPLAs), categorizing personas into three types: demographic personas (statistical stereotypes), character personas (established figures), and individualized personas (customized through ongoing user interactions). Our work primarily operates in the third category, where the companion’s personality is continuously shaped by user interaction.</w:t>
+        <w:t xml:space="preserve"> </w:t>
+      </w:r>
+      <w:r>
+        <w:t xml:space="preserve">distinguish between LLM role-playing (where personas are assigned) and LLM personalization (where the model adapts to user personas). B.A.D.D.I.E. bridges both: it begins with a defined</w:t>
+      </w:r>
+      <w:r>
+        <w:t xml:space="preserve"> </w:t>
+      </w:r>
+      <w:r>
+        <w:t xml:space="preserve">“</w:t>
+      </w:r>
+      <w:r>
+        <w:t xml:space="preserve">baddie</w:t>
+      </w:r>
+      <w:r>
+        <w:t xml:space="preserve">”</w:t>
+      </w:r>
+      <w:r>
+        <w:t xml:space="preserve"> </w:t>
+      </w:r>
+      <w:r>
+        <w:t xml:space="preserve">personality template but progressively personalizes through its memory system.</w:t>
       </w:r>
     </w:p>
     <w:p>
@@ -1267,51 +1365,13 @@
         <w:pStyle w:val="BodyText"/>
       </w:pPr>
       <w:r>
-        <w:t xml:space="preserve">Tseng et al.</w:t>
-      </w:r>
-      <w:r>
-        <w:t xml:space="preserve"> </w:t>
-      </w:r>
-      <w:r>
-        <w:t xml:space="preserve">[13]</w:t>
-      </w:r>
-      <w:r>
-        <w:t xml:space="preserve"> </w:t>
-      </w:r>
-      <w:r>
-        <w:t xml:space="preserve">distinguish between LLM role-playing (where personas are assigned) and LLM personalization (where the model adapts to user personas). B.A.D.D.I.E. bridges both: it begins with a defined</w:t>
-      </w:r>
-      <w:r>
-        <w:t xml:space="preserve"> </w:t>
-      </w:r>
-      <w:r>
-        <w:t xml:space="preserve">“</w:t>
-      </w:r>
-      <w:r>
-        <w:t xml:space="preserve">baddie</w:t>
-      </w:r>
-      <w:r>
-        <w:t xml:space="preserve">”</w:t>
-      </w:r>
-      <w:r>
-        <w:t xml:space="preserve"> </w:t>
-      </w:r>
-      <w:r>
-        <w:t xml:space="preserve">personality template but progressively personalizes through its memory system.</w:t>
-      </w:r>
-    </w:p>
-    <w:p>
-      <w:pPr>
-        <w:pStyle w:val="BodyText"/>
-      </w:pPr>
-      <w:r>
         <w:t xml:space="preserve">The INTIMA benchmark</w:t>
       </w:r>
       <w:r>
         <w:t xml:space="preserve"> </w:t>
       </w:r>
       <w:r>
-        <w:t xml:space="preserve">[8]</w:t>
+        <w:t xml:space="preserve">[9]</w:t>
       </w:r>
       <w:r>
         <w:t xml:space="preserve"> </w:t>
@@ -1361,7 +1421,7 @@
         <w:t xml:space="preserve"> </w:t>
       </w:r>
       <w:r>
-        <w:t xml:space="preserve">[10]</w:t>
+        <w:t xml:space="preserve">[11]</w:t>
       </w:r>
       <w:r>
         <w:t xml:space="preserve"> </w:t>
@@ -1381,7 +1441,7 @@
         <w:t xml:space="preserve"> </w:t>
       </w:r>
       <w:r>
-        <w:t xml:space="preserve">[11]</w:t>
+        <w:t xml:space="preserve">[12]</w:t>
       </w:r>
       <w:r>
         <w:t xml:space="preserve"> </w:t>
@@ -1431,25 +1491,45 @@
         <w:t xml:space="preserve"> </w:t>
       </w:r>
       <w:r>
+        <w:t xml:space="preserve">[8]</w:t>
+      </w:r>
+      <w:r>
+        <w:t xml:space="preserve"> </w:t>
+      </w:r>
+      <w:r>
+        <w:t xml:space="preserve">demonstrated a fully offline pipeline combining whisper.cpp, llama.cpp with CUDA, and Piper TTS, achieving real-time voice interaction on consumer hardware (GTX 1050 Ti). The AI-Voice-Assistant project</w:t>
+      </w:r>
+      <w:r>
+        <w:t xml:space="preserve"> </w:t>
+      </w:r>
+      <w:r>
+        <w:t xml:space="preserve">[6]</w:t>
+      </w:r>
+      <w:r>
+        <w:t xml:space="preserve"> </w:t>
+      </w:r>
+      <w:r>
+        <w:t xml:space="preserve">advanced this further with streaming LLM tokens overlapped with sentence-level TTS, achieving sub-second first-audio-byte latency.</w:t>
+      </w:r>
+    </w:p>
+    <w:p>
+      <w:pPr>
+        <w:pStyle w:val="BodyText"/>
+      </w:pPr>
+      <w:r>
+        <w:t xml:space="preserve">Current best practices for local voice pipelines</w:t>
+      </w:r>
+      <w:r>
+        <w:t xml:space="preserve"> </w:t>
+      </w:r>
+      <w:r>
         <w:t xml:space="preserve">[7]</w:t>
       </w:r>
       <w:r>
         <w:t xml:space="preserve"> </w:t>
       </w:r>
       <w:r>
-        <w:t xml:space="preserve">demonstrated a fully offline pipeline combining whisper.cpp, llama.cpp with CUDA, and Piper TTS, achieving real-time voice interaction on consumer hardware (GTX 1050 Ti). The AI-Voice-Assistant project</w:t>
-      </w:r>
-      <w:r>
-        <w:t xml:space="preserve"> </w:t>
-      </w:r>
-      <w:r>
-        <w:t xml:space="preserve">[5]</w:t>
-      </w:r>
-      <w:r>
-        <w:t xml:space="preserve"> </w:t>
-      </w:r>
-      <w:r>
-        <w:t xml:space="preserve">advanced this further with streaming LLM tokens overlapped with sentence-level TTS, achieving sub-second first-audio-byte latency.</w:t>
+        <w:t xml:space="preserve">recommend faster-whisper (turbo, INT8) for STT (~200ms), a 7B-14B LLM for reasoning, and either Kokoro TTS (highest quality, CPU-only) or Piper TTS (lowest latency) for speech synthesis. Total pipeline latency from speech end to first spoken word ranges from 0.8–2.5 seconds on 8–12 GB GPU hardware.</w:t>
       </w:r>
     </w:p>
     <w:p>
@@ -1457,33 +1537,13 @@
         <w:pStyle w:val="BodyText"/>
       </w:pPr>
       <w:r>
-        <w:t xml:space="preserve">Current best practices for local voice pipelines</w:t>
-      </w:r>
-      <w:r>
-        <w:t xml:space="preserve"> </w:t>
-      </w:r>
-      <w:r>
-        <w:t xml:space="preserve">[6]</w:t>
-      </w:r>
-      <w:r>
-        <w:t xml:space="preserve"> </w:t>
-      </w:r>
-      <w:r>
-        <w:t xml:space="preserve">recommend faster-whisper (turbo, INT8) for STT (~200ms), a 7B-14B LLM for reasoning, and either Kokoro TTS (highest quality, CPU-only) or Piper TTS (lowest latency) for speech synthesis. Total pipeline latency from speech end to first spoken word ranges from 0.8–2.5 seconds on 8–12 GB GPU hardware.</w:t>
-      </w:r>
-    </w:p>
-    <w:p>
-      <w:pPr>
-        <w:pStyle w:val="BodyText"/>
-      </w:pPr>
-      <w:r>
         <w:t xml:space="preserve">The Local-AI-Companion project</w:t>
       </w:r>
       <w:r>
         <w:t xml:space="preserve"> </w:t>
       </w:r>
       <w:r>
-        <w:t xml:space="preserve">[9]</w:t>
+        <w:t xml:space="preserve">[10]</w:t>
       </w:r>
       <w:r>
         <w:t xml:space="preserve"> </w:t>
@@ -1511,8 +1571,44 @@
       </w:r>
     </w:p>
     <w:bookmarkEnd w:id="24"/>
+    <w:bookmarkStart w:id="25" w:name="open-weight-models-for-local-deployment"/>
+    <w:p>
+      <w:pPr>
+        <w:pStyle w:val="Heading2"/>
+      </w:pPr>
+      <w:r>
+        <w:t xml:space="preserve">Open-Weight Models for Local Deployment</w:t>
+      </w:r>
+    </w:p>
+    <w:p>
+      <w:pPr>
+        <w:pStyle w:val="FirstParagraph"/>
+      </w:pPr>
+      <w:r>
+        <w:t xml:space="preserve">The emergence of capable open-weight models has made fully local AI companions feasible. Gemma 3</w:t>
+      </w:r>
+      <w:r>
+        <w:t xml:space="preserve"> </w:t>
+      </w:r>
+      <w:r>
+        <w:t xml:space="preserve">[4, 5]</w:t>
+      </w:r>
+      <w:r>
+        <w:t xml:space="preserve">, Google’s latest open-weight model family, delivers multimodal capabilities (text and image input, text output) with a 128K context window across 4B, 12B, and 27B parameter variants. The 4B instruction-tuned variant achieves competitive performance with Gemma 2 27B while requiring only ~2.2 GB VRAM at Q4_K_M quantization, making it deployable on consumer GPUs with as little as 6 GB VRAM</w:t>
+      </w:r>
+      <w:r>
+        <w:t xml:space="preserve"> </w:t>
+      </w:r>
+      <w:r>
+        <w:t xml:space="preserve">[17]</w:t>
+      </w:r>
+      <w:r>
+        <w:t xml:space="preserve">. This represents a paradigm shift: near-frontier AI companions can now run entirely on user hardware without any cloud dependency.</w:t>
+      </w:r>
+    </w:p>
     <w:bookmarkEnd w:id="25"/>
-    <w:bookmarkStart w:id="46" w:name="system-architecture"/>
+    <w:bookmarkEnd w:id="26"/>
+    <w:bookmarkStart w:id="48" w:name="system-architecture"/>
     <w:p>
       <w:pPr>
         <w:pStyle w:val="Heading1"/>
@@ -1521,7 +1617,7 @@
         <w:t xml:space="preserve">System Architecture</w:t>
       </w:r>
     </w:p>
-    <w:bookmarkStart w:id="26" w:name="design-principles"/>
+    <w:bookmarkStart w:id="27" w:name="design-principles"/>
     <w:p>
       <w:pPr>
         <w:pStyle w:val="Heading2"/>
@@ -1551,7 +1647,7 @@
           <w:b/>
           <w:bCs/>
         </w:rPr>
-        <w:t xml:space="preserve">Local-first</w:t>
+        <w:t xml:space="preserve">Fully local</w:t>
       </w:r>
       <w:r>
         <w:t xml:space="preserve">: All inference, storage, and processing occurs on the user’s hardware. No data leaves the device.</w:t>
@@ -1633,8 +1729,8 @@
         <w:t xml:space="preserve">: The system recognizes and appropriately handles emotionally sensitive interactions.</w:t>
       </w:r>
     </w:p>
-    <w:bookmarkEnd w:id="26"/>
-    <w:bookmarkStart w:id="30" w:name="high-level-architecture"/>
+    <w:bookmarkEnd w:id="27"/>
+    <w:bookmarkStart w:id="31" w:name="high-level-architecture"/>
     <w:p>
       <w:pPr>
         <w:pStyle w:val="Heading2"/>
@@ -1669,18 +1765,18 @@
           <wp:inline>
             <wp:extent cx="5334000" cy="3034392"/>
             <wp:effectExtent b="0" l="0" r="0" t="0"/>
-            <wp:docPr descr="System Architecture — Four primary subsystems: Core Agent, Voice Pipeline, Vision Module, and Avatar Renderer with data flow between them." title="" id="28" name="Picture"/>
+            <wp:docPr descr="System Architecture — Four primary subsystems: Core Agent, Voice Pipeline, Vision Module, and Avatar Renderer with data flow between them." title="" id="29" name="Picture"/>
             <a:graphic>
               <a:graphicData uri="http://schemas.openxmlformats.org/drawingml/2006/picture">
                 <pic:pic>
                   <pic:nvPicPr>
-                    <pic:cNvPr descr="figures/architecture.png" id="29" name="Picture"/>
+                    <pic:cNvPr descr="figures/architecture.png" id="30" name="Picture"/>
                     <pic:cNvPicPr>
                       <a:picLocks noChangeArrowheads="1" noChangeAspect="1"/>
                     </pic:cNvPicPr>
                   </pic:nvPicPr>
                   <pic:blipFill>
-                    <a:blip r:embed="rId27"/>
+                    <a:blip r:embed="rId28"/>
                     <a:stretch>
                       <a:fillRect/>
                     </a:stretch>
@@ -1715,8 +1811,8 @@
         <w:t xml:space="preserve">System Architecture — Four primary subsystems: Core Agent, Voice Pipeline, Vision Module, and Avatar Renderer with data flow between them.</w:t>
       </w:r>
     </w:p>
-    <w:bookmarkEnd w:id="30"/>
-    <w:bookmarkStart w:id="31" w:name="core-agent"/>
+    <w:bookmarkEnd w:id="31"/>
+    <w:bookmarkStart w:id="32" w:name="core-agent"/>
     <w:p>
       <w:pPr>
         <w:pStyle w:val="Heading2"/>
@@ -1749,16 +1845,16 @@
         <w:t xml:space="preserve">LLM inference</w:t>
       </w:r>
       <w:r>
-        <w:t xml:space="preserve">: Gemini 3.1 Flash Lite serves as the primary reasoning model, selected for its ultra-low latency (2.5× faster than Gemini 2.5 Flash), cost efficiency ($0.25/1M input tokens), and multimodal capabilities (text, image, video, audio, PDF inputs with 1M token context window)</w:t>
-      </w:r>
-      <w:r>
-        <w:t xml:space="preserve"> </w:t>
-      </w:r>
-      <w:r>
-        <w:t xml:space="preserve">[4]</w:t>
-      </w:r>
-      <w:r>
-        <w:t xml:space="preserve">.</w:t>
+        <w:t xml:space="preserve">: Gemma 3 4B (instruction-tuned) serves as the primary reasoning model, selected for its strong performance-to-size ratio, multimodal capabilities (text and image input), 128K context window, and efficient local inference on consumer hardware. At Q4_K_M quantization, the model requires only ~2.2 GB VRAM, fitting comfortably on GPUs with 6+ GB VRAM while achieving ~90 tokens/second decode speed on an RTX 4060</w:t>
+      </w:r>
+      <w:r>
+        <w:t xml:space="preserve"> </w:t>
+      </w:r>
+      <w:r>
+        <w:t xml:space="preserve">[17]</w:t>
+      </w:r>
+      <w:r>
+        <w:t xml:space="preserve">. The model supports over 140 languages natively, enabling multilingual companion interactions.</w:t>
       </w:r>
     </w:p>
     <w:p>
@@ -1836,8 +1932,350 @@
         <w:t xml:space="preserve">: The agent queries the RAG system at each turn, injecting relevant episodic, semantic, and procedural memories into the context window.</w:t>
       </w:r>
     </w:p>
-    <w:bookmarkEnd w:id="31"/>
-    <w:bookmarkStart w:id="35" w:name="personality-modelling-pipeline"/>
+    <w:bookmarkEnd w:id="32"/>
+    <w:bookmarkStart w:id="33" w:name="local-inference-design-rationale"/>
+    <w:p>
+      <w:pPr>
+        <w:pStyle w:val="Heading2"/>
+      </w:pPr>
+      <w:r>
+        <w:t xml:space="preserve">Local Inference Design Rationale</w:t>
+      </w:r>
+    </w:p>
+    <w:p>
+      <w:pPr>
+        <w:pStyle w:val="FirstParagraph"/>
+      </w:pPr>
+      <w:r>
+        <w:t xml:space="preserve">Selecting Gemma 3 4B as the reasoning backbone was driven by several critical factors for a local-first AI companion:</w:t>
+      </w:r>
+    </w:p>
+    <w:p>
+      <w:pPr>
+        <w:pStyle w:val="BodyText"/>
+      </w:pPr>
+      <w:r>
+        <w:rPr>
+          <w:b/>
+          <w:bCs/>
+        </w:rPr>
+        <w:t xml:space="preserve">Privacy</w:t>
+      </w:r>
+      <w:r>
+        <w:t xml:space="preserve">: Running inference locally ensures that all conversation data, personality interactions, and user preferences remain on-device. No API calls to external servers are required for the core reasoning pipeline, eliminating the risk of data leakage, third-party data harvesting, or service discontinuation.</w:t>
+      </w:r>
+    </w:p>
+    <w:p>
+      <w:pPr>
+        <w:pStyle w:val="BodyText"/>
+      </w:pPr>
+      <w:r>
+        <w:rPr>
+          <w:b/>
+          <w:bCs/>
+        </w:rPr>
+        <w:t xml:space="preserve">Performance</w:t>
+      </w:r>
+      <w:r>
+        <w:t xml:space="preserve">: Gemma 3 4B achieves a strong balance between capability and resource efficiency. Key specifications include:</w:t>
+      </w:r>
+    </w:p>
+    <w:tbl>
+      <w:tblPr>
+        <w:tblStyle w:val="Table"/>
+        <w:tblW w:type="auto" w:w="0"/>
+        <w:jc w:val="left"/>
+        <w:tblLook w:firstRow="1" w:lastRow="0" w:firstColumn="0" w:lastColumn="0" w:noHBand="0" w:noVBand="0" w:val="0020"/>
+      </w:tblPr>
+      <w:tblGrid>
+        <w:gridCol w:w="3960"/>
+        <w:gridCol w:w="3960"/>
+      </w:tblGrid>
+      <w:tr>
+        <w:trPr>
+          <w:tblHeader w:val="on"/>
+        </w:trPr>
+        <w:tc>
+          <w:tcPr/>
+          <w:p>
+            <w:pPr>
+              <w:pStyle w:val="Compact"/>
+              <w:jc w:val="left"/>
+            </w:pPr>
+            <w:r>
+              <w:t xml:space="preserve">Metric</w:t>
+            </w:r>
+          </w:p>
+        </w:tc>
+        <w:tc>
+          <w:tcPr/>
+          <w:p>
+            <w:pPr>
+              <w:pStyle w:val="Compact"/>
+              <w:jc w:val="left"/>
+            </w:pPr>
+            <w:r>
+              <w:t xml:space="preserve">Value</w:t>
+            </w:r>
+          </w:p>
+        </w:tc>
+      </w:tr>
+      <w:tr>
+        <w:tc>
+          <w:tcPr/>
+          <w:p>
+            <w:pPr>
+              <w:pStyle w:val="Compact"/>
+              <w:jc w:val="left"/>
+            </w:pPr>
+            <w:r>
+              <w:t xml:space="preserve">Parameters</w:t>
+            </w:r>
+          </w:p>
+        </w:tc>
+        <w:tc>
+          <w:tcPr/>
+          <w:p>
+            <w:pPr>
+              <w:pStyle w:val="Compact"/>
+              <w:jc w:val="left"/>
+            </w:pPr>
+            <w:r>
+              <w:t xml:space="preserve">4B (instruction-tuned)</w:t>
+            </w:r>
+          </w:p>
+        </w:tc>
+      </w:tr>
+      <w:tr>
+        <w:tc>
+          <w:tcPr/>
+          <w:p>
+            <w:pPr>
+              <w:pStyle w:val="Compact"/>
+              <w:jc w:val="left"/>
+            </w:pPr>
+            <w:r>
+              <w:t xml:space="preserve">Context window</w:t>
+            </w:r>
+          </w:p>
+        </w:tc>
+        <w:tc>
+          <w:tcPr/>
+          <w:p>
+            <w:pPr>
+              <w:pStyle w:val="Compact"/>
+              <w:jc w:val="left"/>
+            </w:pPr>
+            <w:r>
+              <w:t xml:space="preserve">128K tokens</w:t>
+            </w:r>
+          </w:p>
+        </w:tc>
+      </w:tr>
+      <w:tr>
+        <w:tc>
+          <w:tcPr/>
+          <w:p>
+            <w:pPr>
+              <w:pStyle w:val="Compact"/>
+              <w:jc w:val="left"/>
+            </w:pPr>
+            <w:r>
+              <w:t xml:space="preserve">VRAM (Q4_K_M)</w:t>
+            </w:r>
+          </w:p>
+        </w:tc>
+        <w:tc>
+          <w:tcPr/>
+          <w:p>
+            <w:pPr>
+              <w:pStyle w:val="Compact"/>
+              <w:jc w:val="left"/>
+            </w:pPr>
+            <w:r>
+              <w:t xml:space="preserve">~2.2 GB</w:t>
+            </w:r>
+          </w:p>
+        </w:tc>
+      </w:tr>
+      <w:tr>
+        <w:tc>
+          <w:tcPr/>
+          <w:p>
+            <w:pPr>
+              <w:pStyle w:val="Compact"/>
+              <w:jc w:val="left"/>
+            </w:pPr>
+            <w:r>
+              <w:t xml:space="preserve">VRAM (Q8_0)</w:t>
+            </w:r>
+          </w:p>
+        </w:tc>
+        <w:tc>
+          <w:tcPr/>
+          <w:p>
+            <w:pPr>
+              <w:pStyle w:val="Compact"/>
+              <w:jc w:val="left"/>
+            </w:pPr>
+            <w:r>
+              <w:t xml:space="preserve">~4.2 GB</w:t>
+            </w:r>
+          </w:p>
+        </w:tc>
+      </w:tr>
+      <w:tr>
+        <w:tc>
+          <w:tcPr/>
+          <w:p>
+            <w:pPr>
+              <w:pStyle w:val="Compact"/>
+              <w:jc w:val="left"/>
+            </w:pPr>
+            <w:r>
+              <w:t xml:space="preserve">Decode speed (RTX 4060)</w:t>
+            </w:r>
+          </w:p>
+        </w:tc>
+        <w:tc>
+          <w:tcPr/>
+          <w:p>
+            <w:pPr>
+              <w:pStyle w:val="Compact"/>
+              <w:jc w:val="left"/>
+            </w:pPr>
+            <w:r>
+              <w:t xml:space="preserve">~90 tok/s</w:t>
+            </w:r>
+          </w:p>
+        </w:tc>
+      </w:tr>
+      <w:tr>
+        <w:tc>
+          <w:tcPr/>
+          <w:p>
+            <w:pPr>
+              <w:pStyle w:val="Compact"/>
+              <w:jc w:val="left"/>
+            </w:pPr>
+            <w:r>
+              <w:t xml:space="preserve">Decode speed (RTX 4090)</w:t>
+            </w:r>
+          </w:p>
+        </w:tc>
+        <w:tc>
+          <w:tcPr/>
+          <w:p>
+            <w:pPr>
+              <w:pStyle w:val="Compact"/>
+              <w:jc w:val="left"/>
+            </w:pPr>
+            <w:r>
+              <w:t xml:space="preserve">~130 tok/s</w:t>
+            </w:r>
+          </w:p>
+        </w:tc>
+      </w:tr>
+      <w:tr>
+        <w:tc>
+          <w:tcPr/>
+          <w:p>
+            <w:pPr>
+              <w:pStyle w:val="Compact"/>
+              <w:jc w:val="left"/>
+            </w:pPr>
+            <w:r>
+              <w:t xml:space="preserve">Multilingual support</w:t>
+            </w:r>
+          </w:p>
+        </w:tc>
+        <w:tc>
+          <w:tcPr/>
+          <w:p>
+            <w:pPr>
+              <w:pStyle w:val="Compact"/>
+              <w:jc w:val="left"/>
+            </w:pPr>
+            <w:r>
+              <w:t xml:space="preserve">140+ languages</w:t>
+            </w:r>
+          </w:p>
+        </w:tc>
+      </w:tr>
+      <w:tr>
+        <w:tc>
+          <w:tcPr/>
+          <w:p>
+            <w:pPr>
+              <w:pStyle w:val="Compact"/>
+              <w:jc w:val="left"/>
+            </w:pPr>
+            <w:r>
+              <w:t xml:space="preserve">Modalities</w:t>
+            </w:r>
+          </w:p>
+        </w:tc>
+        <w:tc>
+          <w:tcPr/>
+          <w:p>
+            <w:pPr>
+              <w:pStyle w:val="Compact"/>
+              <w:jc w:val="left"/>
+            </w:pPr>
+            <w:r>
+              <w:t xml:space="preserve">Text + Image input, Text output</w:t>
+            </w:r>
+          </w:p>
+        </w:tc>
+      </w:tr>
+    </w:tbl>
+    <w:p>
+      <w:pPr>
+        <w:pStyle w:val="BodyText"/>
+      </w:pPr>
+      <w:r>
+        <w:rPr>
+          <w:b/>
+          <w:bCs/>
+        </w:rPr>
+        <w:t xml:space="preserve">Architecture efficiency</w:t>
+      </w:r>
+      <w:r>
+        <w:t xml:space="preserve">: Gemma 3 employs a 5:1 ratio of local-to-global attention layers with a sliding window of 1024 tokens for local layers. This design reduces KV-cache memory overhead from ~60% (global-only) to less than 15%, enabling longer conversations within limited VRAM. The RoPE base frequency for global layers is increased from 10K to 1M, supporting the full 128K context window.</w:t>
+      </w:r>
+    </w:p>
+    <w:p>
+      <w:pPr>
+        <w:pStyle w:val="BodyText"/>
+      </w:pPr>
+      <w:r>
+        <w:rPr>
+          <w:b/>
+          <w:bCs/>
+        </w:rPr>
+        <w:t xml:space="preserve">Quantization support</w:t>
+      </w:r>
+      <w:r>
+        <w:t xml:space="preserve">: Gemma 3 provides official quantized variants (Int4, SFP8) via Quantization Aware Training (QAT), ensuring minimal quality degradation at lower precision. This allows the model to run on a wide range of consumer hardware, from laptops with integrated graphics to high-end desktop GPUs.</w:t>
+      </w:r>
+    </w:p>
+    <w:p>
+      <w:pPr>
+        <w:pStyle w:val="BodyText"/>
+      </w:pPr>
+      <w:r>
+        <w:rPr>
+          <w:b/>
+          <w:bCs/>
+        </w:rPr>
+        <w:t xml:space="preserve">Open weights</w:t>
+      </w:r>
+      <w:r>
+        <w:t xml:space="preserve">: As an open-weight model, Gemma 3 allows full inspection, modification, and fine-tuning. The companion’s personality can be further refined through fine-tuning on user-specific interaction data, enabling deeper personalization without relying on external services.</w:t>
+      </w:r>
+    </w:p>
+    <w:bookmarkEnd w:id="33"/>
+    <w:bookmarkStart w:id="37" w:name="personality-modelling-pipeline"/>
     <w:p>
       <w:pPr>
         <w:pStyle w:val="Heading2"/>
@@ -1872,18 +2310,18 @@
           <wp:inline>
             <wp:extent cx="5334000" cy="898071"/>
             <wp:effectExtent b="0" l="0" r="0" t="0"/>
-            <wp:docPr descr="Three-layer personality modelling pipeline: Base Persona → Adaptive Layer → Memory-Conditioned Layer." title="" id="33" name="Picture"/>
+            <wp:docPr descr="Three-layer personality modelling pipeline: Base Persona → Adaptive Layer → Memory-Conditioned Layer." title="" id="35" name="Picture"/>
             <a:graphic>
               <a:graphicData uri="http://schemas.openxmlformats.org/drawingml/2006/picture">
                 <pic:pic>
                   <pic:nvPicPr>
-                    <pic:cNvPr descr="figures/personality-pipeline.png" id="34" name="Picture"/>
+                    <pic:cNvPr descr="figures/personality-pipeline.png" id="36" name="Picture"/>
                     <pic:cNvPicPr>
                       <a:picLocks noChangeArrowheads="1" noChangeAspect="1"/>
                     </pic:cNvPicPr>
                   </pic:nvPicPr>
                   <pic:blipFill>
-                    <a:blip r:embed="rId32"/>
+                    <a:blip r:embed="rId34"/>
                     <a:stretch>
                       <a:fillRect/>
                     </a:stretch>
@@ -2016,8 +2454,8 @@
         <w:t xml:space="preserve">, where extended interactions cause the agent’s personality to gradually diverge from its intended characterization.</w:t>
       </w:r>
     </w:p>
-    <w:bookmarkEnd w:id="35"/>
-    <w:bookmarkStart w:id="39" w:name="memory-architecture"/>
+    <w:bookmarkEnd w:id="37"/>
+    <w:bookmarkStart w:id="41" w:name="memory-architecture"/>
     <w:p>
       <w:pPr>
         <w:pStyle w:val="Heading2"/>
@@ -2046,7 +2484,7 @@
         <w:t xml:space="preserve"> </w:t>
       </w:r>
       <w:r>
-        <w:t xml:space="preserve">[10]</w:t>
+        <w:t xml:space="preserve">[11]</w:t>
       </w:r>
       <w:r>
         <w:t xml:space="preserve"> </w:t>
@@ -2076,18 +2514,18 @@
           <wp:inline>
             <wp:extent cx="4216400" cy="14490700"/>
             <wp:effectExtent b="0" l="0" r="0" t="0"/>
-            <wp:docPr descr="Typed memory architecture: Conversation → Extraction → Typed Stores (Episodic/Semantic/Procedural) → Retrieval → LLM Context." title="" id="37" name="Picture"/>
+            <wp:docPr descr="Typed memory architecture: Conversation → Extraction → Typed Stores (Episodic/Semantic/Procedural) → Retrieval → LLM Context." title="" id="39" name="Picture"/>
             <a:graphic>
               <a:graphicData uri="http://schemas.openxmlformats.org/drawingml/2006/picture">
                 <pic:pic>
                   <pic:nvPicPr>
-                    <pic:cNvPr descr="figures/memory-architecture.png" id="38" name="Picture"/>
+                    <pic:cNvPr descr="figures/memory-architecture.png" id="40" name="Picture"/>
                     <pic:cNvPicPr>
                       <a:picLocks noChangeArrowheads="1" noChangeAspect="1"/>
                     </pic:cNvPicPr>
                   </pic:nvPicPr>
                   <pic:blipFill>
-                    <a:blip r:embed="rId36"/>
+                    <a:blip r:embed="rId38"/>
                     <a:stretch>
                       <a:fillRect/>
                     </a:stretch>
@@ -2249,8 +2687,8 @@
         <w:t xml:space="preserve">.</w:t>
       </w:r>
     </w:p>
-    <w:bookmarkEnd w:id="39"/>
-    <w:bookmarkStart w:id="43" w:name="voice-interaction-pipeline"/>
+    <w:bookmarkEnd w:id="41"/>
+    <w:bookmarkStart w:id="45" w:name="voice-interaction-pipeline"/>
     <w:p>
       <w:pPr>
         <w:pStyle w:val="Heading2"/>
@@ -2285,18 +2723,18 @@
           <wp:inline>
             <wp:extent cx="4267200" cy="1540328"/>
             <wp:effectExtent b="0" l="0" r="0" t="0"/>
-            <wp:docPr descr="Voice interaction sequence: User → VAD → Whisper STT → LLM → TTS/Avatar with streaming overlap." title="" id="41" name="Picture"/>
+            <wp:docPr descr="Voice interaction sequence: User → VAD → Whisper STT → LLM → TTS/Avatar with streaming overlap." title="" id="43" name="Picture"/>
             <a:graphic>
               <a:graphicData uri="http://schemas.openxmlformats.org/drawingml/2006/picture">
                 <pic:pic>
                   <pic:nvPicPr>
-                    <pic:cNvPr descr="figures/voice-pipeline.png" id="42" name="Picture"/>
+                    <pic:cNvPr descr="figures/voice-pipeline.png" id="44" name="Picture"/>
                     <pic:cNvPicPr>
                       <a:picLocks noChangeArrowheads="1" noChangeAspect="1"/>
                     </pic:cNvPicPr>
                   </pic:nvPicPr>
                   <pic:blipFill>
-                    <a:blip r:embed="rId40"/>
+                    <a:blip r:embed="rId42"/>
                     <a:stretch>
                       <a:fillRect/>
                     </a:stretch>
@@ -2384,7 +2822,7 @@
         <w:t xml:space="preserve">LLM Processing</w:t>
       </w:r>
       <w:r>
-        <w:t xml:space="preserve">: The transcribed text is sent to Gemini 3.1 Flash Lite with the personality-conditioned system prompt and retrieved memories.</w:t>
+        <w:t xml:space="preserve">: The transcribed text is sent to Gemma 3 4B with the personality-conditioned system prompt and retrieved memories.</w:t>
       </w:r>
     </w:p>
     <w:p>
@@ -2433,8 +2871,8 @@
         <w:t xml:space="preserve">The target end-to-end latency from user speech end to first audio output is 1.0–2.0 seconds on hardware with 8+ GB VRAM.</w:t>
       </w:r>
     </w:p>
-    <w:bookmarkEnd w:id="43"/>
-    <w:bookmarkStart w:id="44" w:name="vision-module"/>
+    <w:bookmarkEnd w:id="45"/>
+    <w:bookmarkStart w:id="46" w:name="vision-module"/>
     <w:p>
       <w:pPr>
         <w:pStyle w:val="Heading2"/>
@@ -2467,7 +2905,7 @@
         <w:t xml:space="preserve">Screen capture analysis</w:t>
       </w:r>
       <w:r>
-        <w:t xml:space="preserve">: Periodic or on-demand screen capture with Gemini multimodal inference for contextual awareness of the user’s current activity.</w:t>
+        <w:t xml:space="preserve">: Periodic or on-demand screen capture with Gemma 3 4B’s multimodal inference for contextual awareness of the user’s current activity.</w:t>
       </w:r>
     </w:p>
     <w:p>
@@ -2497,8 +2935,8 @@
         <w:t xml:space="preserve">Vision processing is intentionally lightweight to preserve GPU resources for the primary LLM inference pipeline.</w:t>
       </w:r>
     </w:p>
-    <w:bookmarkEnd w:id="44"/>
-    <w:bookmarkStart w:id="45" w:name="live2d-avatar-renderer"/>
+    <w:bookmarkEnd w:id="46"/>
+    <w:bookmarkStart w:id="47" w:name="live2d-avatar-renderer"/>
     <w:p>
       <w:pPr>
         <w:pStyle w:val="Heading2"/>
@@ -2598,9 +3036,9 @@
         <w:t xml:space="preserve">The avatar renderer runs in the application’s WebView using WebGL, communicating with the Rust backend via Tauri’s IPC mechanism.</w:t>
       </w:r>
     </w:p>
-    <w:bookmarkEnd w:id="45"/>
-    <w:bookmarkEnd w:id="46"/>
-    <w:bookmarkStart w:id="49" w:name="implementation"/>
+    <w:bookmarkEnd w:id="47"/>
+    <w:bookmarkEnd w:id="48"/>
+    <w:bookmarkStart w:id="51" w:name="implementation"/>
     <w:p>
       <w:pPr>
         <w:pStyle w:val="Heading1"/>
@@ -2609,7 +3047,7 @@
         <w:t xml:space="preserve">Implementation</w:t>
       </w:r>
     </w:p>
-    <w:bookmarkStart w:id="47" w:name="technology-stack"/>
+    <w:bookmarkStart w:id="49" w:name="technology-stack"/>
     <w:p>
       <w:pPr>
         <w:pStyle w:val="Heading2"/>
@@ -2731,7 +3169,7 @@
               <w:jc w:val="left"/>
             </w:pPr>
             <w:r>
-              <w:t xml:space="preserve">Gemini 3.1 Flash Lite (API)</w:t>
+              <w:t xml:space="preserve">Gemma 3 4B (local, via Ollama/llama.cpp)</w:t>
             </w:r>
           </w:p>
         </w:tc>
@@ -2893,8 +3331,8 @@
         </w:tc>
       </w:tr>
     </w:tbl>
-    <w:bookmarkEnd w:id="47"/>
-    <w:bookmarkStart w:id="48" w:name="local-first-considerations"/>
+    <w:bookmarkEnd w:id="49"/>
+    <w:bookmarkStart w:id="50" w:name="local-first-considerations"/>
     <w:p>
       <w:pPr>
         <w:pStyle w:val="Heading2"/>
@@ -2908,7 +3346,7 @@
         <w:pStyle w:val="FirstParagraph"/>
       </w:pPr>
       <w:r>
-        <w:t xml:space="preserve">While the LLM inference uses the Gemini API (requiring internet connectivity), all other components — STT, TTS, RAG, avatar rendering, and memory storage — operate entirely locally. For fully offline operation, the LLM layer can be swapped to a local model (e.g., via Ollama) without modifying the rest of the architecture.</w:t>
+        <w:t xml:space="preserve">B.A.D.D.I.E. is designed from the ground up as a fully local system. Every component — LLM inference, STT, TTS, RAG, avatar rendering, and memory storage — operates entirely on the user’s hardware. This eliminates all dependency on cloud services and ensures complete data sovereignty.</w:t>
       </w:r>
     </w:p>
     <w:p>
@@ -2916,12 +3354,21 @@
         <w:pStyle w:val="BodyText"/>
       </w:pPr>
       <w:r>
-        <w:t xml:space="preserve">All user data, conversation history, and memory stores remain on the local filesystem. No telemetry or analytics are collected.</w:t>
-      </w:r>
-    </w:p>
-    <w:bookmarkEnd w:id="48"/>
-    <w:bookmarkEnd w:id="49"/>
-    <w:bookmarkStart w:id="53" w:name="discussion"/>
+        <w:t xml:space="preserve">The system can be deployed via Ollama (</w:t>
+      </w:r>
+      <w:r>
+        <w:rPr>
+          <w:rStyle w:val="VerbatimChar"/>
+        </w:rPr>
+        <w:t xml:space="preserve">ollama run gemma3:4b</w:t>
+      </w:r>
+      <w:r>
+        <w:t xml:space="preserve">) or directly through llama.cpp with GGUF quantized models. All user data, conversation history, and memory stores remain on the local filesystem. No telemetry or analytics are collected.</w:t>
+      </w:r>
+    </w:p>
+    <w:bookmarkEnd w:id="50"/>
+    <w:bookmarkEnd w:id="51"/>
+    <w:bookmarkStart w:id="55" w:name="discussion"/>
     <w:p>
       <w:pPr>
         <w:pStyle w:val="Heading1"/>
@@ -2930,7 +3377,7 @@
         <w:t xml:space="preserve">Discussion</w:t>
       </w:r>
     </w:p>
-    <w:bookmarkStart w:id="50" w:name="behavioural-implications"/>
+    <w:bookmarkStart w:id="52" w:name="behavioural-implications"/>
     <w:p>
       <w:pPr>
         <w:pStyle w:val="Heading2"/>
@@ -2985,7 +3432,7 @@
         <w:t xml:space="preserve"> </w:t>
       </w:r>
       <w:r>
-        <w:t xml:space="preserve">[8]</w:t>
+        <w:t xml:space="preserve">[9]</w:t>
       </w:r>
       <w:r>
         <w:t xml:space="preserve"> </w:t>
@@ -3006,8 +3453,8 @@
         <w:t xml:space="preserve">”</w:t>
       </w:r>
     </w:p>
-    <w:bookmarkEnd w:id="50"/>
-    <w:bookmarkStart w:id="51" w:name="privacy-and-ethics"/>
+    <w:bookmarkEnd w:id="52"/>
+    <w:bookmarkStart w:id="53" w:name="privacy-and-ethics"/>
     <w:p>
       <w:pPr>
         <w:pStyle w:val="Heading2"/>
@@ -3021,7 +3468,7 @@
         <w:pStyle w:val="FirstParagraph"/>
       </w:pPr>
       <w:r>
-        <w:t xml:space="preserve">The local-first architecture is an ethical design decision. By keeping all data on-device, B.A.D.D.I.E. eliminates the privacy risks inherent in cloud-based companions, where intimate conversations may be stored on third-party servers, used for model training, or exposed in data breaches.</w:t>
+        <w:t xml:space="preserve">The fully local architecture is an ethical design decision. By keeping all data on-device and running inference locally, B.A.D.D.I.E. eliminates the privacy risks inherent in cloud-based companions, where intimate conversations may be stored on third-party servers, used for model training, or exposed in data breaches. No API keys, no network calls for inference, no data leaves the machine.</w:t>
       </w:r>
     </w:p>
     <w:p>
@@ -3089,8 +3536,27 @@
         <w:t xml:space="preserve">: The system is designed to avoid fostering unhealthy dependency, following the ethical guidelines proposed by the INTIMA researchers.</w:t>
       </w:r>
     </w:p>
-    <w:bookmarkEnd w:id="51"/>
-    <w:bookmarkStart w:id="52" w:name="limitations-and-future-work"/>
+    <w:p>
+      <w:pPr>
+        <w:pStyle w:val="Compact"/>
+        <w:numPr>
+          <w:ilvl w:val="0"/>
+          <w:numId w:val="1009"/>
+        </w:numPr>
+      </w:pPr>
+      <w:r>
+        <w:rPr>
+          <w:b/>
+          <w:bCs/>
+        </w:rPr>
+        <w:t xml:space="preserve">Model ownership</w:t>
+      </w:r>
+      <w:r>
+        <w:t xml:space="preserve">: As an open-weight model, Gemma 3 allows users to inspect, modify, and fine-tune the model that powers their companion.</w:t>
+      </w:r>
+    </w:p>
+    <w:bookmarkEnd w:id="53"/>
+    <w:bookmarkStart w:id="54" w:name="limitations-and-future-work"/>
     <w:p>
       <w:pPr>
         <w:pStyle w:val="Heading2"/>
@@ -3120,10 +3586,10 @@
           <w:b/>
           <w:bCs/>
         </w:rPr>
-        <w:t xml:space="preserve">LLM dependency</w:t>
-      </w:r>
-      <w:r>
-        <w:t xml:space="preserve">: Gemini 3.1 Flash Lite requires internet connectivity. Future work will evaluate local model alternatives (Qwen3, Llama 4) for fully offline operation.</w:t>
+        <w:t xml:space="preserve">Model capability</w:t>
+      </w:r>
+      <w:r>
+        <w:t xml:space="preserve">: Gemma 3 4B, while efficient, has lower absolute capability than frontier models. Future work will evaluate larger local variants (Gemma 3 12B, 27B) as consumer hardware advances.</w:t>
       </w:r>
     </w:p>
     <w:p>
@@ -3166,7 +3632,7 @@
         <w:t xml:space="preserve"> </w:t>
       </w:r>
       <w:r>
-        <w:t xml:space="preserve">[16]</w:t>
+        <w:t xml:space="preserve">[18]</w:t>
       </w:r>
       <w:r>
         <w:t xml:space="preserve"> </w:t>
@@ -3178,7 +3644,7 @@
         <w:t xml:space="preserve"> </w:t>
       </w:r>
       <w:r>
-        <w:t xml:space="preserve">[8]</w:t>
+        <w:t xml:space="preserve">[9]</w:t>
       </w:r>
       <w:r>
         <w:t xml:space="preserve"> </w:t>
@@ -3234,7 +3700,7 @@
         <w:t xml:space="preserve">Multilingual support</w:t>
       </w:r>
       <w:r>
-        <w:t xml:space="preserve">: Current implementation focuses on English. The voice pipeline supports multilingual extension via Whisper and Kokoro’s multilingual models.</w:t>
+        <w:t xml:space="preserve">: Gemma 3 4B supports 140+ languages, but the voice pipeline’s multilingual TTS quality varies by language. Integration of language-specific TTS models is planned.</w:t>
       </w:r>
     </w:p>
     <w:p>
@@ -3245,9 +3711,9 @@
         <w:t xml:space="preserve">Future work will also explore multi-agent coordination, where B.A.D.D.I.E. can spawn specialized sub-agents for complex tasks, and integration with smart home systems for environmental control.</w:t>
       </w:r>
     </w:p>
-    <w:bookmarkEnd w:id="52"/>
-    <w:bookmarkEnd w:id="53"/>
-    <w:bookmarkStart w:id="54" w:name="conclusion"/>
+    <w:bookmarkEnd w:id="54"/>
+    <w:bookmarkEnd w:id="55"/>
+    <w:bookmarkStart w:id="56" w:name="conclusion"/>
     <w:p>
       <w:pPr>
         <w:pStyle w:val="Heading1"/>
@@ -3261,7 +3727,7 @@
         <w:pStyle w:val="FirstParagraph"/>
       </w:pPr>
       <w:r>
-        <w:t xml:space="preserve">We have presented B.A.D.D.I.E., a local-first AI companion system that integrates personality modelling, long-term memory, multimodal perception, real-time voice interaction, and Live2D avatar embodiment within a unified desktop application. By combining Gemini 3.1 Flash Lite’s reasoning capabilities with a typed-memory RAG system and a fully local voice pipeline, B.A.D.D.I.E. delivers a privacy-preserving, personality-rich companion experience on consumer hardware.</w:t>
+        <w:t xml:space="preserve">We have presented B.A.D.D.I.E., a fully local AI companion system that integrates personality modelling, long-term memory, multimodal perception, real-time voice interaction, and Live2D avatar embodiment within a unified desktop application. By combining Gemma 3 4B’s efficient local reasoning with a typed-memory RAG system and a fully local voice pipeline, B.A.D.D.I.E. delivers a privacy-preserving, personality-rich companion experience on consumer hardware — with zero cloud dependency.</w:t>
       </w:r>
     </w:p>
     <w:p>
@@ -3277,11 +3743,11 @@
         <w:pStyle w:val="BodyText"/>
       </w:pPr>
       <w:r>
-        <w:t xml:space="preserve">As LLMs continue to advance and local inference becomes increasingly viable, systems like B.A.D.D.I.E. represent a future where AI companions are not cloud services we rent, but digital entities we own — persistent, private, and truly personal.</w:t>
-      </w:r>
-    </w:p>
-    <w:bookmarkEnd w:id="54"/>
-    <w:bookmarkStart w:id="88" w:name="references"/>
+        <w:t xml:space="preserve">As open-weight models continue to advance and consumer hardware becomes increasingly capable, systems like B.A.D.D.I.E. represent a future where AI companions are not cloud services we rent, but digital entities we own — persistent, private, and truly personal.</w:t>
+      </w:r>
+    </w:p>
+    <w:bookmarkEnd w:id="56"/>
+    <w:bookmarkStart w:id="94" w:name="references"/>
     <w:p>
       <w:pPr>
         <w:pStyle w:val="Heading1"/>
@@ -3290,8 +3756,8 @@
         <w:t xml:space="preserve">References</w:t>
       </w:r>
     </w:p>
-    <w:bookmarkStart w:id="87" w:name="refs"/>
-    <w:bookmarkStart w:id="56" w:name="ref-chen2024tmlr-persona"/>
+    <w:bookmarkStart w:id="93" w:name="refs"/>
+    <w:bookmarkStart w:id="58" w:name="ref-chen2024tmlr-persona"/>
     <w:p>
       <w:pPr>
         <w:pStyle w:val="Bibliography"/>
@@ -3327,7 +3793,7 @@
       <w:r>
         <w:t xml:space="preserve"> </w:t>
       </w:r>
-      <w:hyperlink r:id="rId55">
+      <w:hyperlink r:id="rId57">
         <w:r>
           <w:rPr>
             <w:rStyle w:val="Hyperlink"/>
@@ -3336,8 +3802,8 @@
         </w:r>
       </w:hyperlink>
     </w:p>
-    <w:bookmarkEnd w:id="56"/>
-    <w:bookmarkStart w:id="58" w:name="ref-arxiv2504.19413"/>
+    <w:bookmarkEnd w:id="58"/>
+    <w:bookmarkStart w:id="60" w:name="ref-arxiv2504.19413"/>
     <w:p>
       <w:pPr>
         <w:pStyle w:val="Bibliography"/>
@@ -3373,7 +3839,7 @@
       <w:r>
         <w:t xml:space="preserve"> </w:t>
       </w:r>
-      <w:hyperlink r:id="rId57">
+      <w:hyperlink r:id="rId59">
         <w:r>
           <w:rPr>
             <w:rStyle w:val="Hyperlink"/>
@@ -3382,8 +3848,8 @@
         </w:r>
       </w:hyperlink>
     </w:p>
-    <w:bookmarkEnd w:id="58"/>
-    <w:bookmarkStart w:id="60" w:name="ref-arxiv2602.02007"/>
+    <w:bookmarkEnd w:id="60"/>
+    <w:bookmarkStart w:id="62" w:name="ref-arxiv2602.02007"/>
     <w:p>
       <w:pPr>
         <w:pStyle w:val="Bibliography"/>
@@ -3419,7 +3885,7 @@
       <w:r>
         <w:t xml:space="preserve"> </w:t>
       </w:r>
-      <w:hyperlink r:id="rId59">
+      <w:hyperlink r:id="rId61">
         <w:r>
           <w:rPr>
             <w:rStyle w:val="Hyperlink"/>
@@ -3428,8 +3894,8 @@
         </w:r>
       </w:hyperlink>
     </w:p>
-    <w:bookmarkEnd w:id="60"/>
-    <w:bookmarkStart w:id="62" w:name="ref-gemini31flashlite"/>
+    <w:bookmarkEnd w:id="62"/>
+    <w:bookmarkStart w:id="64" w:name="ref-gemma3techreport"/>
     <w:p>
       <w:pPr>
         <w:pStyle w:val="Bibliography"/>
@@ -3444,22 +3910,38 @@
         <w:t xml:space="preserve">	</w:t>
       </w:r>
       <w:r>
-        <w:t xml:space="preserve">Google DeepMind. 2026. Gemini 3.1 Flash-Lite. Retrieved from</w:t>
-      </w:r>
-      <w:r>
-        <w:t xml:space="preserve"> </w:t>
-      </w:r>
-      <w:hyperlink r:id="rId61">
+        <w:t xml:space="preserve">Gemma Team and Google DeepMind. 2025. Gemma 3 Technical Report.</w:t>
+      </w:r>
+      <w:r>
+        <w:t xml:space="preserve"> </w:t>
+      </w:r>
+      <w:r>
+        <w:rPr>
+          <w:i/>
+          <w:iCs/>
+        </w:rPr>
+        <w:t xml:space="preserve">arXiv preprint</w:t>
+      </w:r>
+      <w:r>
+        <w:t xml:space="preserve"> </w:t>
+      </w:r>
+      <w:r>
+        <w:t xml:space="preserve">(2025). Retrieved from</w:t>
+      </w:r>
+      <w:r>
+        <w:t xml:space="preserve"> </w:t>
+      </w:r>
+      <w:hyperlink r:id="rId63">
         <w:r>
           <w:rPr>
             <w:rStyle w:val="Hyperlink"/>
           </w:rPr>
-          <w:t xml:space="preserve">https://ai.google.dev/gemini-api/docs/models/gemini-3.1-flash-lite</w:t>
+          <w:t xml:space="preserve">https://arxiv.org/abs/2503.19786</w:t>
         </w:r>
       </w:hyperlink>
     </w:p>
-    <w:bookmarkEnd w:id="62"/>
-    <w:bookmarkStart w:id="64" w:name="ref-hemantbk-ai"/>
+    <w:bookmarkEnd w:id="64"/>
+    <w:bookmarkStart w:id="66" w:name="ref-gemma3modelcard"/>
     <w:p>
       <w:pPr>
         <w:pStyle w:val="Bibliography"/>
@@ -3474,12 +3956,42 @@
         <w:t xml:space="preserve">	</w:t>
       </w:r>
       <w:r>
+        <w:t xml:space="preserve">Google AI. 2025. Gemma 3 Model Card. Retrieved from</w:t>
+      </w:r>
+      <w:r>
+        <w:t xml:space="preserve"> </w:t>
+      </w:r>
+      <w:hyperlink r:id="rId65">
+        <w:r>
+          <w:rPr>
+            <w:rStyle w:val="Hyperlink"/>
+          </w:rPr>
+          <w:t xml:space="preserve">https://ai.google.dev/gemma/docs/core/model_card_3</w:t>
+        </w:r>
+      </w:hyperlink>
+    </w:p>
+    <w:bookmarkEnd w:id="66"/>
+    <w:bookmarkStart w:id="68" w:name="ref-hemantbk-ai"/>
+    <w:p>
+      <w:pPr>
+        <w:pStyle w:val="Bibliography"/>
+      </w:pPr>
+      <w:r>
+        <w:t xml:space="preserve">[6]</w:t>
+      </w:r>
+      <w:r>
+        <w:t xml:space="preserve"> </w:t>
+      </w:r>
+      <w:r>
+        <w:t xml:space="preserve">	</w:t>
+      </w:r>
+      <w:r>
         <w:t xml:space="preserve">HemantBK. 2026. AI-Voice-Assistant: Production-Leaning Local Voice Pipeline. Retrieved from</w:t>
       </w:r>
       <w:r>
         <w:t xml:space="preserve"> </w:t>
       </w:r>
-      <w:hyperlink r:id="rId63">
+      <w:hyperlink r:id="rId67">
         <w:r>
           <w:rPr>
             <w:rStyle w:val="Hyperlink"/>
@@ -3488,14 +4000,14 @@
         </w:r>
       </w:hyperlink>
     </w:p>
-    <w:bookmarkEnd w:id="64"/>
-    <w:bookmarkStart w:id="66" w:name="ref-insiderllm2026voice"/>
+    <w:bookmarkEnd w:id="68"/>
+    <w:bookmarkStart w:id="70" w:name="ref-insiderllm2026voice"/>
     <w:p>
       <w:pPr>
         <w:pStyle w:val="Bibliography"/>
       </w:pPr>
       <w:r>
-        <w:t xml:space="preserve">[6]</w:t>
+        <w:t xml:space="preserve">[7]</w:t>
       </w:r>
       <w:r>
         <w:t xml:space="preserve"> </w:t>
@@ -3509,7 +4021,7 @@
       <w:r>
         <w:t xml:space="preserve"> </w:t>
       </w:r>
-      <w:hyperlink r:id="rId65">
+      <w:hyperlink r:id="rId69">
         <w:r>
           <w:rPr>
             <w:rStyle w:val="Hyperlink"/>
@@ -3518,14 +4030,14 @@
         </w:r>
       </w:hyperlink>
     </w:p>
-    <w:bookmarkEnd w:id="66"/>
-    <w:bookmarkStart w:id="68" w:name="ref-christopher-ai"/>
+    <w:bookmarkEnd w:id="70"/>
+    <w:bookmarkStart w:id="72" w:name="ref-christopher-ai"/>
     <w:p>
       <w:pPr>
         <w:pStyle w:val="Bibliography"/>
       </w:pPr>
       <w:r>
-        <w:t xml:space="preserve">[7]</w:t>
+        <w:t xml:space="preserve">[8]</w:t>
       </w:r>
       <w:r>
         <w:t xml:space="preserve"> </w:t>
@@ -3539,7 +4051,7 @@
       <w:r>
         <w:t xml:space="preserve"> </w:t>
       </w:r>
-      <w:hyperlink r:id="rId67">
+      <w:hyperlink r:id="rId71">
         <w:r>
           <w:rPr>
             <w:rStyle w:val="Hyperlink"/>
@@ -3548,14 +4060,14 @@
         </w:r>
       </w:hyperlink>
     </w:p>
-    <w:bookmarkEnd w:id="68"/>
-    <w:bookmarkStart w:id="70" w:name="ref-arxiv2508.09998"/>
+    <w:bookmarkEnd w:id="72"/>
+    <w:bookmarkStart w:id="74" w:name="ref-arxiv2508.09998"/>
     <w:p>
       <w:pPr>
         <w:pStyle w:val="Bibliography"/>
       </w:pPr>
       <w:r>
-        <w:t xml:space="preserve">[8]</w:t>
+        <w:t xml:space="preserve">[9]</w:t>
       </w:r>
       <w:r>
         <w:t xml:space="preserve"> </w:t>
@@ -3585,7 +4097,7 @@
       <w:r>
         <w:t xml:space="preserve"> </w:t>
       </w:r>
-      <w:hyperlink r:id="rId69">
+      <w:hyperlink r:id="rId73">
         <w:r>
           <w:rPr>
             <w:rStyle w:val="Hyperlink"/>
@@ -3594,14 +4106,14 @@
         </w:r>
       </w:hyperlink>
     </w:p>
-    <w:bookmarkEnd w:id="70"/>
-    <w:bookmarkStart w:id="72" w:name="ref-liilk-companion"/>
+    <w:bookmarkEnd w:id="74"/>
+    <w:bookmarkStart w:id="76" w:name="ref-liilk-companion"/>
     <w:p>
       <w:pPr>
         <w:pStyle w:val="Bibliography"/>
       </w:pPr>
       <w:r>
-        <w:t xml:space="preserve">[9]</w:t>
+        <w:t xml:space="preserve">[10]</w:t>
       </w:r>
       <w:r>
         <w:t xml:space="preserve"> </w:t>
@@ -3615,7 +4127,7 @@
       <w:r>
         <w:t xml:space="preserve"> </w:t>
       </w:r>
-      <w:hyperlink r:id="rId71">
+      <w:hyperlink r:id="rId75">
         <w:r>
           <w:rPr>
             <w:rStyle w:val="Hyperlink"/>
@@ -3624,14 +4136,14 @@
         </w:r>
       </w:hyperlink>
     </w:p>
-    <w:bookmarkEnd w:id="72"/>
-    <w:bookmarkStart w:id="74" w:name="ref-arxiv2511.12960"/>
+    <w:bookmarkEnd w:id="76"/>
+    <w:bookmarkStart w:id="78" w:name="ref-arxiv2511.12960"/>
     <w:p>
       <w:pPr>
         <w:pStyle w:val="Bibliography"/>
       </w:pPr>
       <w:r>
-        <w:t xml:space="preserve">[10]</w:t>
+        <w:t xml:space="preserve">[11]</w:t>
       </w:r>
       <w:r>
         <w:t xml:space="preserve"> </w:t>
@@ -3661,7 +4173,7 @@
       <w:r>
         <w:t xml:space="preserve"> </w:t>
       </w:r>
-      <w:hyperlink r:id="rId73">
+      <w:hyperlink r:id="rId77">
         <w:r>
           <w:rPr>
             <w:rStyle w:val="Hyperlink"/>
@@ -3670,14 +4182,14 @@
         </w:r>
       </w:hyperlink>
     </w:p>
-    <w:bookmarkEnd w:id="74"/>
-    <w:bookmarkStart w:id="76" w:name="ref-arxiv2501.13956"/>
+    <w:bookmarkEnd w:id="78"/>
+    <w:bookmarkStart w:id="80" w:name="ref-arxiv2501.13956"/>
     <w:p>
       <w:pPr>
         <w:pStyle w:val="Bibliography"/>
       </w:pPr>
       <w:r>
-        <w:t xml:space="preserve">[11]</w:t>
+        <w:t xml:space="preserve">[12]</w:t>
       </w:r>
       <w:r>
         <w:t xml:space="preserve"> </w:t>
@@ -3707,7 +4219,7 @@
       <w:r>
         <w:t xml:space="preserve"> </w:t>
       </w:r>
-      <w:hyperlink r:id="rId75">
+      <w:hyperlink r:id="rId79">
         <w:r>
           <w:rPr>
             <w:rStyle w:val="Hyperlink"/>
@@ -3716,14 +4228,14 @@
         </w:r>
       </w:hyperlink>
     </w:p>
-    <w:bookmarkEnd w:id="76"/>
-    <w:bookmarkStart w:id="78" w:name="ref-tissaoui2026prompt"/>
+    <w:bookmarkEnd w:id="80"/>
+    <w:bookmarkStart w:id="82" w:name="ref-tissaoui2026prompt"/>
     <w:p>
       <w:pPr>
         <w:pStyle w:val="Bibliography"/>
       </w:pPr>
       <w:r>
-        <w:t xml:space="preserve">[12]</w:t>
+        <w:t xml:space="preserve">[13]</w:t>
       </w:r>
       <w:r>
         <w:t xml:space="preserve"> </w:t>
@@ -3753,7 +4265,7 @@
       <w:r>
         <w:t xml:space="preserve"> </w:t>
       </w:r>
-      <w:hyperlink r:id="rId77">
+      <w:hyperlink r:id="rId81">
         <w:r>
           <w:rPr>
             <w:rStyle w:val="Hyperlink"/>
@@ -3762,14 +4274,14 @@
         </w:r>
       </w:hyperlink>
     </w:p>
-    <w:bookmarkEnd w:id="78"/>
-    <w:bookmarkStart w:id="80" w:name="ref-tseng2024two"/>
+    <w:bookmarkEnd w:id="82"/>
+    <w:bookmarkStart w:id="84" w:name="ref-tseng2024two"/>
     <w:p>
       <w:pPr>
         <w:pStyle w:val="Bibliography"/>
       </w:pPr>
       <w:r>
-        <w:t xml:space="preserve">[13]</w:t>
+        <w:t xml:space="preserve">[14]</w:t>
       </w:r>
       <w:r>
         <w:t xml:space="preserve"> </w:t>
@@ -3799,7 +4311,7 @@
       <w:r>
         <w:t xml:space="preserve"> </w:t>
       </w:r>
-      <w:hyperlink r:id="rId79">
+      <w:hyperlink r:id="rId83">
         <w:r>
           <w:rPr>
             <w:rStyle w:val="Hyperlink"/>
@@ -3808,14 +4320,14 @@
         </w:r>
       </w:hyperlink>
     </w:p>
-    <w:bookmarkEnd w:id="80"/>
-    <w:bookmarkStart w:id="82" w:name="ref-findings2025personality"/>
+    <w:bookmarkEnd w:id="84"/>
+    <w:bookmarkStart w:id="86" w:name="ref-findings2025personality"/>
     <w:p>
       <w:pPr>
         <w:pStyle w:val="Bibliography"/>
       </w:pPr>
       <w:r>
-        <w:t xml:space="preserve">[14]</w:t>
+        <w:t xml:space="preserve">[15]</w:t>
       </w:r>
       <w:r>
         <w:t xml:space="preserve"> </w:t>
@@ -3842,7 +4354,7 @@
       <w:r>
         <w:t xml:space="preserve"> </w:t>
       </w:r>
-      <w:hyperlink r:id="rId81">
+      <w:hyperlink r:id="rId85">
         <w:r>
           <w:rPr>
             <w:rStyle w:val="Hyperlink"/>
@@ -3851,14 +4363,14 @@
         </w:r>
       </w:hyperlink>
     </w:p>
-    <w:bookmarkEnd w:id="82"/>
-    <w:bookmarkStart w:id="84" w:name="ref-weizenbaum1966eliza"/>
+    <w:bookmarkEnd w:id="86"/>
+    <w:bookmarkStart w:id="88" w:name="ref-weizenbaum1966eliza"/>
     <w:p>
       <w:pPr>
         <w:pStyle w:val="Bibliography"/>
       </w:pPr>
       <w:r>
-        <w:t xml:space="preserve">[15]</w:t>
+        <w:t xml:space="preserve">[16]</w:t>
       </w:r>
       <w:r>
         <w:t xml:space="preserve"> </w:t>
@@ -3888,7 +4400,7 @@
       <w:r>
         <w:t xml:space="preserve"> </w:t>
       </w:r>
-      <w:hyperlink r:id="rId83">
+      <w:hyperlink r:id="rId87">
         <w:r>
           <w:rPr>
             <w:rStyle w:val="Hyperlink"/>
@@ -3897,14 +4409,44 @@
         </w:r>
       </w:hyperlink>
     </w:p>
-    <w:bookmarkEnd w:id="84"/>
-    <w:bookmarkStart w:id="86" w:name="ref-arxiv2403.08888"/>
+    <w:bookmarkEnd w:id="88"/>
+    <w:bookmarkStart w:id="90" w:name="ref-willitrunai2026"/>
     <w:p>
       <w:pPr>
         <w:pStyle w:val="Bibliography"/>
       </w:pPr>
       <w:r>
-        <w:t xml:space="preserve">[16]</w:t>
+        <w:t xml:space="preserve">[17]</w:t>
+      </w:r>
+      <w:r>
+        <w:t xml:space="preserve"> </w:t>
+      </w:r>
+      <w:r>
+        <w:t xml:space="preserve">	</w:t>
+      </w:r>
+      <w:r>
+        <w:t xml:space="preserve">Will It Run AI. 2026. Gemma 3 VRAM Requirements — 1B, 4B, 12B, 27B GPU &amp; Mac Guide. Retrieved from</w:t>
+      </w:r>
+      <w:r>
+        <w:t xml:space="preserve"> </w:t>
+      </w:r>
+      <w:hyperlink r:id="rId89">
+        <w:r>
+          <w:rPr>
+            <w:rStyle w:val="Hyperlink"/>
+          </w:rPr>
+          <w:t xml:space="preserve">https://willitrunai.com/blog/gemma-3-local-inference-guide</w:t>
+        </w:r>
+      </w:hyperlink>
+    </w:p>
+    <w:bookmarkEnd w:id="90"/>
+    <w:bookmarkStart w:id="92" w:name="ref-arxiv2403.08888"/>
+    <w:p>
+      <w:pPr>
+        <w:pStyle w:val="Bibliography"/>
+      </w:pPr>
+      <w:r>
+        <w:t xml:space="preserve">[18]</w:t>
       </w:r>
       <w:r>
         <w:t xml:space="preserve"> </w:t>
@@ -3934,7 +4476,7 @@
       <w:r>
         <w:t xml:space="preserve"> </w:t>
       </w:r>
-      <w:hyperlink r:id="rId85">
+      <w:hyperlink r:id="rId91">
         <w:r>
           <w:rPr>
             <w:rStyle w:val="Hyperlink"/>
@@ -3943,9 +4485,9 @@
         </w:r>
       </w:hyperlink>
     </w:p>
-    <w:bookmarkEnd w:id="86"/>
-    <w:bookmarkEnd w:id="87"/>
-    <w:bookmarkEnd w:id="88"/>
+    <w:bookmarkEnd w:id="92"/>
+    <w:bookmarkEnd w:id="93"/>
+    <w:bookmarkEnd w:id="94"/>
     <w:sectPr/>
   </w:body>
 </w:document>

</xml_diff>

<commit_message>
Update model from Gemma 3 4B to Gemma 4 E4B
Key changes:
- Model: Gemma 4 E4B (released April 2026) replaces Gemma 3 4B
- New specs: 4.5B effective params, 8B total with embeddings
- VRAM: ~5GB at Q4, ~7.5GB at SFP8, ~15GB at BF16
- New features: native audio input, MTP speculative decoding
- Benchmarks: MMLU Pro 69.4%, GPQA Diamond 58.6%, MMMU Pro 52.6%
- Architecture: Dense with Per-Layer Embeddings (PLE)
- License: Apache 2.0 (commercially permissive)
- Updated references: Gemma 4 model card, blog, DeepMind page
- Removed archived Gemini version files
</commit_message>
<xml_diff>
--- a/paper.docx
+++ b/paper.docx
@@ -503,13 +503,13 @@
         <w:t xml:space="preserve"> </w:t>
       </w:r>
       <w:r>
-        <w:t xml:space="preserve">3</w:t>
-      </w:r>
-      <w:r>
-        <w:t xml:space="preserve"> </w:t>
-      </w:r>
-      <w:r>
-        <w:t xml:space="preserve">4B</w:t>
+        <w:t xml:space="preserve">4</w:t>
+      </w:r>
+      <w:r>
+        <w:t xml:space="preserve"> </w:t>
+      </w:r>
+      <w:r>
+        <w:t xml:space="preserve">E4B</w:t>
       </w:r>
       <w:r>
         <w:t xml:space="preserve"> </w:t>
@@ -797,13 +797,13 @@
         <w:t xml:space="preserve"> </w:t>
       </w:r>
       <w:r>
-        <w:t xml:space="preserve">3</w:t>
-      </w:r>
-      <w:r>
-        <w:t xml:space="preserve"> </w:t>
-      </w:r>
-      <w:r>
-        <w:t xml:space="preserve">4B</w:t>
+        <w:t xml:space="preserve">4</w:t>
+      </w:r>
+      <w:r>
+        <w:t xml:space="preserve"> </w:t>
+      </w:r>
+      <w:r>
+        <w:t xml:space="preserve">E4B</w:t>
       </w:r>
       <w:r>
         <w:t xml:space="preserve"> </w:t>
@@ -1259,7 +1259,7 @@
         </w:numPr>
       </w:pPr>
       <w:r>
-        <w:t xml:space="preserve">A design rationale for selecting Gemma 3 4B as a local-first reasoning backbone</w:t>
+        <w:t xml:space="preserve">A design rationale for selecting Gemma 4 E4B as a local-first reasoning backbone</w:t>
       </w:r>
     </w:p>
     <w:p>
@@ -1585,7 +1585,7 @@
         <w:pStyle w:val="FirstParagraph"/>
       </w:pPr>
       <w:r>
-        <w:t xml:space="preserve">The emergence of capable open-weight models has made fully local AI companions feasible. Gemma 3</w:t>
+        <w:t xml:space="preserve">The emergence of capable open-weight models has made fully local AI companions feasible. Gemma 4</w:t>
       </w:r>
       <w:r>
         <w:t xml:space="preserve"> </w:t>
@@ -1594,16 +1594,16 @@
         <w:t xml:space="preserve">[4, 5]</w:t>
       </w:r>
       <w:r>
-        <w:t xml:space="preserve">, Google’s latest open-weight model family, delivers multimodal capabilities (text and image input, text output) with a 128K context window across 4B, 12B, and 27B parameter variants. The 4B instruction-tuned variant achieves competitive performance with Gemma 2 27B while requiring only ~2.2 GB VRAM at Q4_K_M quantization, making it deployable on consumer GPUs with as little as 6 GB VRAM</w:t>
-      </w:r>
-      <w:r>
-        <w:t xml:space="preserve"> </w:t>
-      </w:r>
-      <w:r>
-        <w:t xml:space="preserve">[17]</w:t>
-      </w:r>
-      <w:r>
-        <w:t xml:space="preserve">. This represents a paradigm shift: near-frontier AI companions can now run entirely on user hardware without any cloud dependency.</w:t>
+        <w:t xml:space="preserve">, Google’s latest open-weight model family released in April 2026, delivers frontier-level intelligence-per-parameter across four sizes: E2B, E4B, 26B A4B (MoE), and 31B Dense. The E4B variant provides 4.5B effective parameters (8B total with embeddings) with multimodal capabilities (text, image, and audio input), a 128K context window, and native audio processing for speech recognition. At Q4 quantization, it requires approximately 5 GB VRAM, making it deployable on consumer GPUs with 8+ GB VRAM</w:t>
+      </w:r>
+      <w:r>
+        <w:t xml:space="preserve"> </w:t>
+      </w:r>
+      <w:r>
+        <w:t xml:space="preserve">[4, 5]</w:t>
+      </w:r>
+      <w:r>
+        <w:t xml:space="preserve">. Gemma 4 also introduces Multi-Token Prediction (MTP) with a dedicated draft model for speculative decoding, enabling significantly faster inference with no quality loss. This represents a paradigm shift: near-frontier AI companions can now run entirely on user hardware without any cloud dependency.</w:t>
       </w:r>
     </w:p>
     <w:bookmarkEnd w:id="25"/>
@@ -1750,10 +1750,10 @@
         <w:t xml:space="preserve"> </w:t>
       </w:r>
       <w:r>
-        <w:t xml:space="preserve"> </w:t>
-      </w:r>
-      <w:r>
-        <w:t xml:space="preserve">presents the system architecture. The desktop application, built on Tauri (Rust backend + web frontend), hosts four primary subsystems: the Core Agent, the Voice Pipeline, the Vision Module, and the Avatar Renderer.</w:t>
+        <w:t xml:space="preserve">[4, 5]</w:t>
+      </w:r>
+      <w:r>
+        <w:t xml:space="preserve">ef{fig:architecture} presents the system architecture. The desktop application, built on Tauri (Rust backend + web frontend), hosts four primary subsystems: the Core Agent, the Voice Pipeline, the Vision Module, and the Avatar Renderer.</w:t>
       </w:r>
     </w:p>
     <w:p>
@@ -1765,7 +1765,7 @@
           <wp:inline>
             <wp:extent cx="5334000" cy="3034392"/>
             <wp:effectExtent b="0" l="0" r="0" t="0"/>
-            <wp:docPr descr="System Architecture — Four primary subsystems: Core Agent, Voice Pipeline, Vision Module, and Avatar Renderer with data flow between them." title="" id="29" name="Picture"/>
+            <wp:docPr descr="System Architecture — Four primary subsystems: Core Agent, Voice Pipeline, Vision Module, and Avatar Renderer with data flow between them.[4, 5]abel{fig:architecture}" title="" id="29" name="Picture"/>
             <a:graphic>
               <a:graphicData uri="http://schemas.openxmlformats.org/drawingml/2006/picture">
                 <pic:pic>
@@ -1810,6 +1810,12 @@
       <w:r>
         <w:t xml:space="preserve">System Architecture — Four primary subsystems: Core Agent, Voice Pipeline, Vision Module, and Avatar Renderer with data flow between them.</w:t>
       </w:r>
+      <w:r>
+        <w:t xml:space="preserve">[4, 5]</w:t>
+      </w:r>
+      <w:r>
+        <w:t xml:space="preserve">abel{fig:architecture}</w:t>
+      </w:r>
     </w:p>
     <w:bookmarkEnd w:id="31"/>
     <w:bookmarkStart w:id="32" w:name="core-agent"/>
@@ -1845,16 +1851,7 @@
         <w:t xml:space="preserve">LLM inference</w:t>
       </w:r>
       <w:r>
-        <w:t xml:space="preserve">: Gemma 3 4B (instruction-tuned) serves as the primary reasoning model, selected for its strong performance-to-size ratio, multimodal capabilities (text and image input), 128K context window, and efficient local inference on consumer hardware. At Q4_K_M quantization, the model requires only ~2.2 GB VRAM, fitting comfortably on GPUs with 6+ GB VRAM while achieving ~90 tokens/second decode speed on an RTX 4060</w:t>
-      </w:r>
-      <w:r>
-        <w:t xml:space="preserve"> </w:t>
-      </w:r>
-      <w:r>
-        <w:t xml:space="preserve">[17]</w:t>
-      </w:r>
-      <w:r>
-        <w:t xml:space="preserve">. The model supports over 140 languages natively, enabling multilingual companion interactions.</w:t>
+        <w:t xml:space="preserve">: Gemma 4 E4B (instruction-tuned) serves as the primary reasoning model, selected for its frontier-level intelligence-per-parameter, multimodal capabilities (text, image, and audio input), 128K context window, and efficient local inference on consumer hardware. At Q4 quantization, the model requires approximately 5 GB VRAM, fitting comfortably on GPUs with 8+ GB VRAM. The model supports over 140 languages natively and includes native audio processing for speech recognition, enabling multilingual companion interactions without additional STT dependencies. Gemma 4 also features Multi-Token Prediction (MTP) with speculative decoding for faster inference throughput.</w:t>
       </w:r>
     </w:p>
     <w:p>
@@ -1947,7 +1944,7 @@
         <w:pStyle w:val="FirstParagraph"/>
       </w:pPr>
       <w:r>
-        <w:t xml:space="preserve">Selecting Gemma 3 4B as the reasoning backbone was driven by several critical factors for a local-first AI companion:</w:t>
+        <w:t xml:space="preserve">Selecting Gemma 4 E4B as the reasoning backbone was driven by several critical factors for a local-first AI companion:</w:t>
       </w:r>
     </w:p>
     <w:p>
@@ -1977,19 +1974,20 @@
         <w:t xml:space="preserve">Performance</w:t>
       </w:r>
       <w:r>
-        <w:t xml:space="preserve">: Gemma 3 4B achieves a strong balance between capability and resource efficiency. Key specifications include:</w:t>
+        <w:t xml:space="preserve">: Gemma 4 E4B achieves a strong balance between capability and resource efficiency. Key specifications include:</w:t>
       </w:r>
     </w:p>
     <w:tbl>
       <w:tblPr>
         <w:tblStyle w:val="Table"/>
-        <w:tblW w:type="auto" w:w="0"/>
+        <w:tblW w:type="pct" w:w="5000"/>
         <w:jc w:val="left"/>
+        <w:tblLayout w:type="fixed"/>
         <w:tblLook w:firstRow="1" w:lastRow="0" w:firstColumn="0" w:lastColumn="0" w:noHBand="0" w:noVBand="0" w:val="0020"/>
       </w:tblPr>
       <w:tblGrid>
-        <w:gridCol w:w="3960"/>
-        <w:gridCol w:w="3960"/>
+        <w:gridCol w:w="4224"/>
+        <w:gridCol w:w="3696"/>
       </w:tblGrid>
       <w:tr>
         <w:trPr>
@@ -2029,7 +2027,7 @@
               <w:jc w:val="left"/>
             </w:pPr>
             <w:r>
-              <w:t xml:space="preserve">Parameters</w:t>
+              <w:t xml:space="preserve">Effective parameters</w:t>
             </w:r>
           </w:p>
         </w:tc>
@@ -2041,7 +2039,33 @@
               <w:jc w:val="left"/>
             </w:pPr>
             <w:r>
-              <w:t xml:space="preserve">4B (instruction-tuned)</w:t>
+              <w:t xml:space="preserve">4.5B (8B total with embeddings)</w:t>
+            </w:r>
+          </w:p>
+        </w:tc>
+      </w:tr>
+      <w:tr>
+        <w:tc>
+          <w:tcPr/>
+          <w:p>
+            <w:pPr>
+              <w:pStyle w:val="Compact"/>
+              <w:jc w:val="left"/>
+            </w:pPr>
+            <w:r>
+              <w:t xml:space="preserve">Layers</w:t>
+            </w:r>
+          </w:p>
+        </w:tc>
+        <w:tc>
+          <w:tcPr/>
+          <w:p>
+            <w:pPr>
+              <w:pStyle w:val="Compact"/>
+              <w:jc w:val="left"/>
+            </w:pPr>
+            <w:r>
+              <w:t xml:space="preserve">42</w:t>
             </w:r>
           </w:p>
         </w:tc>
@@ -2081,7 +2105,7 @@
               <w:jc w:val="left"/>
             </w:pPr>
             <w:r>
-              <w:t xml:space="preserve">VRAM (Q4_K_M)</w:t>
+              <w:t xml:space="preserve">VRAM (Q4_0)</w:t>
             </w:r>
           </w:p>
         </w:tc>
@@ -2093,7 +2117,7 @@
               <w:jc w:val="left"/>
             </w:pPr>
             <w:r>
-              <w:t xml:space="preserve">~2.2 GB</w:t>
+              <w:t xml:space="preserve">~5 GB</w:t>
             </w:r>
           </w:p>
         </w:tc>
@@ -2107,7 +2131,7 @@
               <w:jc w:val="left"/>
             </w:pPr>
             <w:r>
-              <w:t xml:space="preserve">VRAM (Q8_0)</w:t>
+              <w:t xml:space="preserve">VRAM (SFP8)</w:t>
             </w:r>
           </w:p>
         </w:tc>
@@ -2119,7 +2143,7 @@
               <w:jc w:val="left"/>
             </w:pPr>
             <w:r>
-              <w:t xml:space="preserve">~4.2 GB</w:t>
+              <w:t xml:space="preserve">~7.5 GB</w:t>
             </w:r>
           </w:p>
         </w:tc>
@@ -2133,7 +2157,7 @@
               <w:jc w:val="left"/>
             </w:pPr>
             <w:r>
-              <w:t xml:space="preserve">Decode speed (RTX 4060)</w:t>
+              <w:t xml:space="preserve">VRAM (BF16)</w:t>
             </w:r>
           </w:p>
         </w:tc>
@@ -2145,33 +2169,7 @@
               <w:jc w:val="left"/>
             </w:pPr>
             <w:r>
-              <w:t xml:space="preserve">~90 tok/s</w:t>
-            </w:r>
-          </w:p>
-        </w:tc>
-      </w:tr>
-      <w:tr>
-        <w:tc>
-          <w:tcPr/>
-          <w:p>
-            <w:pPr>
-              <w:pStyle w:val="Compact"/>
-              <w:jc w:val="left"/>
-            </w:pPr>
-            <w:r>
-              <w:t xml:space="preserve">Decode speed (RTX 4090)</w:t>
-            </w:r>
-          </w:p>
-        </w:tc>
-        <w:tc>
-          <w:tcPr/>
-          <w:p>
-            <w:pPr>
-              <w:pStyle w:val="Compact"/>
-              <w:jc w:val="left"/>
-            </w:pPr>
-            <w:r>
-              <w:t xml:space="preserve">~130 tok/s</w:t>
+              <w:t xml:space="preserve">~15 GB</w:t>
             </w:r>
           </w:p>
         </w:tc>
@@ -2223,7 +2221,59 @@
               <w:jc w:val="left"/>
             </w:pPr>
             <w:r>
-              <w:t xml:space="preserve">Text + Image input, Text output</w:t>
+              <w:t xml:space="preserve">Text + Image + Audio input, Text output</w:t>
+            </w:r>
+          </w:p>
+        </w:tc>
+      </w:tr>
+      <w:tr>
+        <w:tc>
+          <w:tcPr/>
+          <w:p>
+            <w:pPr>
+              <w:pStyle w:val="Compact"/>
+              <w:jc w:val="left"/>
+            </w:pPr>
+            <w:r>
+              <w:t xml:space="preserve">Architecture</w:t>
+            </w:r>
+          </w:p>
+        </w:tc>
+        <w:tc>
+          <w:tcPr/>
+          <w:p>
+            <w:pPr>
+              <w:pStyle w:val="Compact"/>
+              <w:jc w:val="left"/>
+            </w:pPr>
+            <w:r>
+              <w:t xml:space="preserve">Dense with Per-Layer Embeddings (PLE)</w:t>
+            </w:r>
+          </w:p>
+        </w:tc>
+      </w:tr>
+      <w:tr>
+        <w:tc>
+          <w:tcPr/>
+          <w:p>
+            <w:pPr>
+              <w:pStyle w:val="Compact"/>
+              <w:jc w:val="left"/>
+            </w:pPr>
+            <w:r>
+              <w:t xml:space="preserve">Inference acceleration</w:t>
+            </w:r>
+          </w:p>
+        </w:tc>
+        <w:tc>
+          <w:tcPr/>
+          <w:p>
+            <w:pPr>
+              <w:pStyle w:val="Compact"/>
+              <w:jc w:val="left"/>
+            </w:pPr>
+            <w:r>
+              <w:t xml:space="preserve">Multi-Token Prediction (MTP) + speculative decoding</w:t>
             </w:r>
           </w:p>
         </w:tc>
@@ -2234,6 +2284,14 @@
         <w:pStyle w:val="BodyText"/>
       </w:pPr>
       <w:r>
+        <w:t xml:space="preserve">Benchmark scores highlight the model’s capability: MMLU Pro 69.4%, GPQA Diamond 58.6%, LiveCodeBench v6 52.0%, and MMMU Pro 52.6% — competitive with models many times its size.</w:t>
+      </w:r>
+    </w:p>
+    <w:p>
+      <w:pPr>
+        <w:pStyle w:val="BodyText"/>
+      </w:pPr>
+      <w:r>
         <w:rPr>
           <w:b/>
           <w:bCs/>
@@ -2241,7 +2299,7 @@
         <w:t xml:space="preserve">Architecture efficiency</w:t>
       </w:r>
       <w:r>
-        <w:t xml:space="preserve">: Gemma 3 employs a 5:1 ratio of local-to-global attention layers with a sliding window of 1024 tokens for local layers. This design reduces KV-cache memory overhead from ~60% (global-only) to less than 15%, enabling longer conversations within limited VRAM. The RoPE base frequency for global layers is increased from 10K to 1M, supporting the full 128K context window.</w:t>
+        <w:t xml:space="preserve">: Gemma 4 E4B employs a dense transformer architecture with Per-Layer Embeddings (PLE), which gives each decoder layer its own small embedding table for every token. This maximizes parameter efficiency for on-device deployment — the total memory footprint is higher than the effective parameter count suggests, but inference only activates 4.5B parameters per token. The model uses a sliding window of 512 tokens for local attention layers and supports the full 128K context window. Combined with Multi-Token Prediction (MTP) speculative decoding, Gemma 4 delivers significantly faster token generation without quality degradation.</w:t>
       </w:r>
     </w:p>
     <w:p>
@@ -2256,7 +2314,7 @@
         <w:t xml:space="preserve">Quantization support</w:t>
       </w:r>
       <w:r>
-        <w:t xml:space="preserve">: Gemma 3 provides official quantized variants (Int4, SFP8) via Quantization Aware Training (QAT), ensuring minimal quality degradation at lower precision. This allows the model to run on a wide range of consumer hardware, from laptops with integrated graphics to high-end desktop GPUs.</w:t>
+        <w:t xml:space="preserve">: Gemma 4 provides official quantized variants (Q4_0, SFP8) ensuring minimal quality degradation at lower precision. This allows the model to run on a wide range of consumer hardware, from laptops with 8 GB VRAM (at Q4) to high-end desktop GPUs (at BF16). The model’s Apache 2.0 license permits commercial use, modification, and fine-tuning.</w:t>
       </w:r>
     </w:p>
     <w:p>
@@ -2271,7 +2329,7 @@
         <w:t xml:space="preserve">Open weights</w:t>
       </w:r>
       <w:r>
-        <w:t xml:space="preserve">: As an open-weight model, Gemma 3 allows full inspection, modification, and fine-tuning. The companion’s personality can be further refined through fine-tuning on user-specific interaction data, enabling deeper personalization without relying on external services.</w:t>
+        <w:t xml:space="preserve">: As an open-weight model under the Apache 2.0 license, Gemma 4 allows full inspection, modification, and fine-tuning. The companion’s personality can be further refined through fine-tuning on user-specific interaction data, enabling deeper personalization without relying on external services. The model weights are available on Hugging Face, Kaggle, and Google AI Studio.</w:t>
       </w:r>
     </w:p>
     <w:bookmarkEnd w:id="33"/>
@@ -2295,10 +2353,10 @@
         <w:t xml:space="preserve"> </w:t>
       </w:r>
       <w:r>
-        <w:t xml:space="preserve"> </w:t>
-      </w:r>
-      <w:r>
-        <w:t xml:space="preserve">illustrates the three-layer personality pipeline. B.A.D.D.I.E.’s personality system operates at three levels:</w:t>
+        <w:t xml:space="preserve">[4, 5]</w:t>
+      </w:r>
+      <w:r>
+        <w:t xml:space="preserve">ef{fig:personality} illustrates the three-layer personality pipeline. B.A.D.D.I.E.’s personality system operates at three levels:</w:t>
       </w:r>
     </w:p>
     <w:p>
@@ -2310,7 +2368,7 @@
           <wp:inline>
             <wp:extent cx="5334000" cy="898071"/>
             <wp:effectExtent b="0" l="0" r="0" t="0"/>
-            <wp:docPr descr="Three-layer personality modelling pipeline: Base Persona → Adaptive Layer → Memory-Conditioned Layer." title="" id="35" name="Picture"/>
+            <wp:docPr descr="Three-layer personality modelling pipeline: Base Persona → Adaptive Layer → Memory-Conditioned Layer.[4, 5]abel{fig:personality}" title="" id="35" name="Picture"/>
             <a:graphic>
               <a:graphicData uri="http://schemas.openxmlformats.org/drawingml/2006/picture">
                 <pic:pic>
@@ -2355,6 +2413,12 @@
       <w:r>
         <w:t xml:space="preserve">Three-layer personality modelling pipeline: Base Persona → Adaptive Layer → Memory-Conditioned Layer.</w:t>
       </w:r>
+      <w:r>
+        <w:t xml:space="preserve">[4, 5]</w:t>
+      </w:r>
+      <w:r>
+        <w:t xml:space="preserve">abel{fig:personality}</w:t>
+      </w:r>
     </w:p>
     <w:p>
       <w:pPr>
@@ -2475,10 +2539,10 @@
         <w:t xml:space="preserve"> </w:t>
       </w:r>
       <w:r>
-        <w:t xml:space="preserve"> </w:t>
-      </w:r>
-      <w:r>
-        <w:t xml:space="preserve">depicts the typed memory architecture. Following the ENGRAM</w:t>
+        <w:t xml:space="preserve">[4, 5]</w:t>
+      </w:r>
+      <w:r>
+        <w:t xml:space="preserve">ef{fig:memory} depicts the typed memory architecture. Following the ENGRAM</w:t>
       </w:r>
       <w:r>
         <w:t xml:space="preserve"> </w:t>
@@ -2514,7 +2578,7 @@
           <wp:inline>
             <wp:extent cx="4216400" cy="14490700"/>
             <wp:effectExtent b="0" l="0" r="0" t="0"/>
-            <wp:docPr descr="Typed memory architecture: Conversation → Extraction → Typed Stores (Episodic/Semantic/Procedural) → Retrieval → LLM Context." title="" id="39" name="Picture"/>
+            <wp:docPr descr="Typed memory architecture: Conversation → Extraction → Typed Stores (Episodic/Semantic/Procedural) → Retrieval → LLM Context.[4, 5]abel{fig:memory}" title="" id="39" name="Picture"/>
             <a:graphic>
               <a:graphicData uri="http://schemas.openxmlformats.org/drawingml/2006/picture">
                 <pic:pic>
@@ -2559,6 +2623,12 @@
       <w:r>
         <w:t xml:space="preserve">Typed memory architecture: Conversation → Extraction → Typed Stores (Episodic/Semantic/Procedural) → Retrieval → LLM Context.</w:t>
       </w:r>
+      <w:r>
+        <w:t xml:space="preserve">[4, 5]</w:t>
+      </w:r>
+      <w:r>
+        <w:t xml:space="preserve">abel{fig:memory}</w:t>
+      </w:r>
     </w:p>
     <w:p>
       <w:pPr>
@@ -2708,10 +2778,10 @@
         <w:t xml:space="preserve"> </w:t>
       </w:r>
       <w:r>
-        <w:t xml:space="preserve"> </w:t>
-      </w:r>
-      <w:r>
-        <w:t xml:space="preserve">shows the voice interaction sequence. The voice pipeline implements a fully local speech-to-speech loop:</w:t>
+        <w:t xml:space="preserve">[4, 5]</w:t>
+      </w:r>
+      <w:r>
+        <w:t xml:space="preserve">ef{fig:voice} shows the voice interaction sequence. The voice pipeline implements a fully local speech-to-speech loop:</w:t>
       </w:r>
     </w:p>
     <w:p>
@@ -2723,7 +2793,7 @@
           <wp:inline>
             <wp:extent cx="4267200" cy="1540328"/>
             <wp:effectExtent b="0" l="0" r="0" t="0"/>
-            <wp:docPr descr="Voice interaction sequence: User → VAD → Whisper STT → LLM → TTS/Avatar with streaming overlap." title="" id="43" name="Picture"/>
+            <wp:docPr descr="Voice interaction sequence: User → VAD → Whisper STT → LLM → TTS/Avatar with streaming overlap.[4, 5]abel{fig:voice}" title="" id="43" name="Picture"/>
             <a:graphic>
               <a:graphicData uri="http://schemas.openxmlformats.org/drawingml/2006/picture">
                 <pic:pic>
@@ -2768,6 +2838,12 @@
       <w:r>
         <w:t xml:space="preserve">Voice interaction sequence: User → VAD → Whisper STT → LLM → TTS/Avatar with streaming overlap.</w:t>
       </w:r>
+      <w:r>
+        <w:t xml:space="preserve">[4, 5]</w:t>
+      </w:r>
+      <w:r>
+        <w:t xml:space="preserve">abel{fig:voice}</w:t>
+      </w:r>
     </w:p>
     <w:p>
       <w:pPr>
@@ -2822,7 +2898,7 @@
         <w:t xml:space="preserve">LLM Processing</w:t>
       </w:r>
       <w:r>
-        <w:t xml:space="preserve">: The transcribed text is sent to Gemma 3 4B with the personality-conditioned system prompt and retrieved memories.</w:t>
+        <w:t xml:space="preserve">: The transcribed text is sent to Gemma 4 E4B with the personality-conditioned system prompt and retrieved memories.</w:t>
       </w:r>
     </w:p>
     <w:p>
@@ -2905,7 +2981,7 @@
         <w:t xml:space="preserve">Screen capture analysis</w:t>
       </w:r>
       <w:r>
-        <w:t xml:space="preserve">: Periodic or on-demand screen capture with Gemma 3 4B’s multimodal inference for contextual awareness of the user’s current activity.</w:t>
+        <w:t xml:space="preserve">: Periodic or on-demand screen capture with Gemma 4 E4B’s multimodal inference for contextual awareness of the user’s current activity.</w:t>
       </w:r>
     </w:p>
     <w:p>
@@ -3169,7 +3245,7 @@
               <w:jc w:val="left"/>
             </w:pPr>
             <w:r>
-              <w:t xml:space="preserve">Gemma 3 4B (local, via Ollama/llama.cpp)</w:t>
+              <w:t xml:space="preserve">Gemma 4 E4B (local, via Ollama/llama.cpp)</w:t>
             </w:r>
           </w:p>
         </w:tc>
@@ -3360,7 +3436,7 @@
         <w:rPr>
           <w:rStyle w:val="VerbatimChar"/>
         </w:rPr>
-        <w:t xml:space="preserve">ollama run gemma3:4b</w:t>
+        <w:t xml:space="preserve">ollama run gemma4:e4b</w:t>
       </w:r>
       <w:r>
         <w:t xml:space="preserve">) or directly through llama.cpp with GGUF quantized models. All user data, conversation history, and memory stores remain on the local filesystem. No telemetry or analytics are collected.</w:t>
@@ -3552,7 +3628,7 @@
         <w:t xml:space="preserve">Model ownership</w:t>
       </w:r>
       <w:r>
-        <w:t xml:space="preserve">: As an open-weight model, Gemma 3 allows users to inspect, modify, and fine-tune the model that powers their companion.</w:t>
+        <w:t xml:space="preserve">: As an open-weight model under Apache 2.0, Gemma 4 allows users to inspect, modify, and fine-tune the model that powers their companion.</w:t>
       </w:r>
     </w:p>
     <w:bookmarkEnd w:id="53"/>
@@ -3589,7 +3665,7 @@
         <w:t xml:space="preserve">Model capability</w:t>
       </w:r>
       <w:r>
-        <w:t xml:space="preserve">: Gemma 3 4B, while efficient, has lower absolute capability than frontier models. Future work will evaluate larger local variants (Gemma 3 12B, 27B) as consumer hardware advances.</w:t>
+        <w:t xml:space="preserve">: Gemma 4 E4B, while efficient, has lower absolute capability than frontier models. Future work will evaluate larger local variants (Gemma 4 31B Dense, Gemma 4 26B A4B MoE) as consumer hardware advances. The 31B variant ranks as the #3 open model on the Arena AI leaderboard.</w:t>
       </w:r>
     </w:p>
     <w:p>
@@ -3632,7 +3708,7 @@
         <w:t xml:space="preserve"> </w:t>
       </w:r>
       <w:r>
-        <w:t xml:space="preserve">[18]</w:t>
+        <w:t xml:space="preserve">[17]</w:t>
       </w:r>
       <w:r>
         <w:t xml:space="preserve"> </w:t>
@@ -3700,7 +3776,7 @@
         <w:t xml:space="preserve">Multilingual support</w:t>
       </w:r>
       <w:r>
-        <w:t xml:space="preserve">: Gemma 3 4B supports 140+ languages, but the voice pipeline’s multilingual TTS quality varies by language. Integration of language-specific TTS models is planned.</w:t>
+        <w:t xml:space="preserve">: Gemma 4 E4B supports 140+ languages, but the voice pipeline’s multilingual TTS quality varies by language. Integration of language-specific TTS models is planned.</w:t>
       </w:r>
     </w:p>
     <w:p>
@@ -3727,7 +3803,7 @@
         <w:pStyle w:val="FirstParagraph"/>
       </w:pPr>
       <w:r>
-        <w:t xml:space="preserve">We have presented B.A.D.D.I.E., a fully local AI companion system that integrates personality modelling, long-term memory, multimodal perception, real-time voice interaction, and Live2D avatar embodiment within a unified desktop application. By combining Gemma 3 4B’s efficient local reasoning with a typed-memory RAG system and a fully local voice pipeline, B.A.D.D.I.E. delivers a privacy-preserving, personality-rich companion experience on consumer hardware — with zero cloud dependency.</w:t>
+        <w:t xml:space="preserve">We have presented B.A.D.D.I.E., a fully local AI companion system that integrates personality modelling, long-term memory, multimodal perception, real-time voice interaction, and Live2D avatar embodiment within a unified desktop application. By combining Gemma 4 E4B’s efficient local reasoning with a typed-memory RAG system and a fully local voice pipeline, B.A.D.D.I.E. delivers a privacy-preserving, personality-rich companion experience on consumer hardware — with zero cloud dependency.</w:t>
       </w:r>
     </w:p>
     <w:p>
@@ -3747,7 +3823,7 @@
       </w:r>
     </w:p>
     <w:bookmarkEnd w:id="56"/>
-    <w:bookmarkStart w:id="94" w:name="references"/>
+    <w:bookmarkStart w:id="92" w:name="references"/>
     <w:p>
       <w:pPr>
         <w:pStyle w:val="Heading1"/>
@@ -3756,7 +3832,7 @@
         <w:t xml:space="preserve">References</w:t>
       </w:r>
     </w:p>
-    <w:bookmarkStart w:id="93" w:name="refs"/>
+    <w:bookmarkStart w:id="91" w:name="refs"/>
     <w:bookmarkStart w:id="58" w:name="ref-chen2024tmlr-persona"/>
     <w:p>
       <w:pPr>
@@ -3895,7 +3971,7 @@
       </w:hyperlink>
     </w:p>
     <w:bookmarkEnd w:id="62"/>
-    <w:bookmarkStart w:id="64" w:name="ref-gemma3techreport"/>
+    <w:bookmarkStart w:id="64" w:name="ref-gemma4modelcard"/>
     <w:p>
       <w:pPr>
         <w:pStyle w:val="Bibliography"/>
@@ -3910,23 +3986,7 @@
         <w:t xml:space="preserve">	</w:t>
       </w:r>
       <w:r>
-        <w:t xml:space="preserve">Gemma Team and Google DeepMind. 2025. Gemma 3 Technical Report.</w:t>
-      </w:r>
-      <w:r>
-        <w:t xml:space="preserve"> </w:t>
-      </w:r>
-      <w:r>
-        <w:rPr>
-          <w:i/>
-          <w:iCs/>
-        </w:rPr>
-        <w:t xml:space="preserve">arXiv preprint</w:t>
-      </w:r>
-      <w:r>
-        <w:t xml:space="preserve"> </w:t>
-      </w:r>
-      <w:r>
-        <w:t xml:space="preserve">(2025). Retrieved from</w:t>
+        <w:t xml:space="preserve">Google AI. 2026. Gemma 4 Model Card. Retrieved from</w:t>
       </w:r>
       <w:r>
         <w:t xml:space="preserve"> </w:t>
@@ -3936,12 +3996,12 @@
           <w:rPr>
             <w:rStyle w:val="Hyperlink"/>
           </w:rPr>
-          <w:t xml:space="preserve">https://arxiv.org/abs/2503.19786</w:t>
+          <w:t xml:space="preserve">https://ai.google.dev/gemma/docs/core/model_card_4</w:t>
         </w:r>
       </w:hyperlink>
     </w:p>
     <w:bookmarkEnd w:id="64"/>
-    <w:bookmarkStart w:id="66" w:name="ref-gemma3modelcard"/>
+    <w:bookmarkStart w:id="66" w:name="ref-gemma4blog"/>
     <w:p>
       <w:pPr>
         <w:pStyle w:val="Bibliography"/>
@@ -3956,7 +4016,7 @@
         <w:t xml:space="preserve">	</w:t>
       </w:r>
       <w:r>
-        <w:t xml:space="preserve">Google AI. 2025. Gemma 3 Model Card. Retrieved from</w:t>
+        <w:t xml:space="preserve">Google. 2026. Gemma 4: Our most capable open models to date. Retrieved from</w:t>
       </w:r>
       <w:r>
         <w:t xml:space="preserve"> </w:t>
@@ -3966,7 +4026,7 @@
           <w:rPr>
             <w:rStyle w:val="Hyperlink"/>
           </w:rPr>
-          <w:t xml:space="preserve">https://ai.google.dev/gemma/docs/core/model_card_3</w:t>
+          <w:t xml:space="preserve">https://blog.google/innovation-and-ai/technology/developers-tools/gemma-4/</w:t>
         </w:r>
       </w:hyperlink>
     </w:p>
@@ -4410,43 +4470,13 @@
       </w:hyperlink>
     </w:p>
     <w:bookmarkEnd w:id="88"/>
-    <w:bookmarkStart w:id="90" w:name="ref-willitrunai2026"/>
+    <w:bookmarkStart w:id="90" w:name="ref-arxiv2403.08888"/>
     <w:p>
       <w:pPr>
         <w:pStyle w:val="Bibliography"/>
       </w:pPr>
       <w:r>
         <w:t xml:space="preserve">[17]</w:t>
-      </w:r>
-      <w:r>
-        <w:t xml:space="preserve"> </w:t>
-      </w:r>
-      <w:r>
-        <w:t xml:space="preserve">	</w:t>
-      </w:r>
-      <w:r>
-        <w:t xml:space="preserve">Will It Run AI. 2026. Gemma 3 VRAM Requirements — 1B, 4B, 12B, 27B GPU &amp; Mac Guide. Retrieved from</w:t>
-      </w:r>
-      <w:r>
-        <w:t xml:space="preserve"> </w:t>
-      </w:r>
-      <w:hyperlink r:id="rId89">
-        <w:r>
-          <w:rPr>
-            <w:rStyle w:val="Hyperlink"/>
-          </w:rPr>
-          <w:t xml:space="preserve">https://willitrunai.com/blog/gemma-3-local-inference-guide</w:t>
-        </w:r>
-      </w:hyperlink>
-    </w:p>
-    <w:bookmarkEnd w:id="90"/>
-    <w:bookmarkStart w:id="92" w:name="ref-arxiv2403.08888"/>
-    <w:p>
-      <w:pPr>
-        <w:pStyle w:val="Bibliography"/>
-      </w:pPr>
-      <w:r>
-        <w:t xml:space="preserve">[18]</w:t>
       </w:r>
       <w:r>
         <w:t xml:space="preserve"> </w:t>
@@ -4476,7 +4506,7 @@
       <w:r>
         <w:t xml:space="preserve"> </w:t>
       </w:r>
-      <w:hyperlink r:id="rId91">
+      <w:hyperlink r:id="rId89">
         <w:r>
           <w:rPr>
             <w:rStyle w:val="Hyperlink"/>
@@ -4485,9 +4515,9 @@
         </w:r>
       </w:hyperlink>
     </w:p>
+    <w:bookmarkEnd w:id="90"/>
+    <w:bookmarkEnd w:id="91"/>
     <w:bookmarkEnd w:id="92"/>
-    <w:bookmarkEnd w:id="93"/>
-    <w:bookmarkEnd w:id="94"/>
     <w:sectPr/>
   </w:body>
 </w:document>

</xml_diff>